<commit_message>
Revise replication materials for JIE major revision
Recast the trade-agreement projection as a stylised scenario sensitivity
analysis, in line with the reviewer's recommendation.

- Add scripts/05_sensitivity_analysis.py: sweep shock magnitude (0.5-1.5x)
  and phase-in (3-10 yr); the category ordering is robust in all 20 cases
  whilst the magnitudes are conditional on the assumed shocks.
- Add figures/fig07_sensitivity.png (sensitivity envelope).
- README: recast scenario section; correct the rank-selection description
  (smooth R2 increase, no elbow; K=6 chosen on interpretability); relabel
  the bootstrap bands as trend-only.
- .zenodo.json: update title and keywords (territorial extraction;
  scenario analysis).
- supplementary_information.docx: corrected Table S2 diagnostics; new
  Tables S7 (sensitivity envelope) and S8 (NTF vs MFA subcategory totals).

Co-Authored-By: Claude Fable 5 <noreply@anthropic.com>
</commit_message>
<xml_diff>
--- a/supplementary_information.docx
+++ b/supplementary_information.docx
@@ -16,7 +16,7 @@
           <w:b/>
           <w:i w:val="0"/>
         </w:rPr>
-        <w:t>Multi-dimensional decomposition of material extraction patterns: Projecting the MERCOSUR-EU trade agreement</w:t>
+        <w:t>Multi-dimensional decomposition of material extraction patterns: A stylised scenario analysis of the MERCOSUR-EU trade agreement</w:t>
       </w:r>
     </w:p>
     <w:p>
@@ -34,7 +34,7 @@
     </w:p>
     <w:p>
       <w:r>
-        <w:t>Classification of 367 GLORIA material satellite indicators into four MFA categories and 15 subcategories following EUROSTAT/UNEP-IRP conventions (EUROSTAT 2018).</w:t>
+        <w:t>Classification of 367 GLORIA material satellite indicators into four MFA categories and 15 subcategories following EUROSTAT/UNEP-IRP conventions (EUROSTAT, 2018).</w:t>
       </w:r>
     </w:p>
     <w:tbl>
@@ -1189,7 +1189,7 @@
         <w:t>K</w:t>
       </w:r>
       <w:r>
-        <w:t xml:space="preserve"> = 10. For each rank: variance explained (</w:t>
+        <w:t xml:space="preserve"> = 10, all screened under identical settings (three random initialisations per rank, 500 iterations, lowest-error solution retained) so that the values are directly comparable across ranks. For each rank: relative reconstruction error, variance explained (</w:t>
       </w:r>
       <w:r>
         <w:rPr>
@@ -1219,17 +1219,7 @@
         <w:t>K</w:t>
       </w:r>
       <w:r>
-        <w:t xml:space="preserve"> − 1, and sparsity (proportion of loadings below 10⁻⁶). Results for </w:t>
-      </w:r>
-      <w:r>
-        <w:rPr>
-          <w:b w:val="0"/>
-          <w:i/>
-        </w:rPr>
-        <w:t>K</w:t>
-      </w:r>
-      <w:r>
-        <w:t xml:space="preserve"> = 6 correspond to the final model fitted with 10 random initialisations; all other ranks were fitted with three initialisations.</w:t>
+        <w:t xml:space="preserve"> − 1, and sparsity (proportion of loadings below 10⁻⁶).</w:t>
       </w:r>
     </w:p>
     <w:tbl>
@@ -1240,15 +1230,16 @@
         <w:tblLook w:firstColumn="1" w:firstRow="1" w:lastColumn="0" w:lastRow="0" w:noHBand="0" w:noVBand="1" w:val="04A0"/>
       </w:tblPr>
       <w:tblGrid>
-        <w:gridCol w:w="2160"/>
-        <w:gridCol w:w="2160"/>
-        <w:gridCol w:w="2160"/>
-        <w:gridCol w:w="2160"/>
+        <w:gridCol w:w="1728"/>
+        <w:gridCol w:w="1728"/>
+        <w:gridCol w:w="1728"/>
+        <w:gridCol w:w="1728"/>
+        <w:gridCol w:w="1728"/>
       </w:tblGrid>
       <w:tr>
         <w:tc>
           <w:tcPr>
-            <w:tcW w:type="dxa" w:w="2160"/>
+            <w:tcW w:type="dxa" w:w="1728"/>
           </w:tcPr>
           <w:p>
             <w:pPr>
@@ -1272,7 +1263,30 @@
         </w:tc>
         <w:tc>
           <w:tcPr>
-            <w:tcW w:type="dxa" w:w="2160"/>
+            <w:tcW w:type="dxa" w:w="1728"/>
+          </w:tcPr>
+          <w:p>
+            <w:pPr>
+              <w:spacing w:after="40" w:line="240" w:lineRule="auto"/>
+            </w:pPr>
+            <w:r>
+              <w:rPr>
+                <w:b/>
+                <w:sz w:val="20"/>
+              </w:rPr>
+            </w:r>
+            <w:r>
+              <w:rPr>
+                <w:b/>
+                <w:sz w:val="20"/>
+              </w:rPr>
+              <w:t>Relative error</w:t>
+            </w:r>
+          </w:p>
+        </w:tc>
+        <w:tc>
+          <w:tcPr>
+            <w:tcW w:type="dxa" w:w="1728"/>
           </w:tcPr>
           <w:p>
             <w:pPr>
@@ -1303,7 +1317,7 @@
         </w:tc>
         <w:tc>
           <w:tcPr>
-            <w:tcW w:type="dxa" w:w="2160"/>
+            <w:tcW w:type="dxa" w:w="1728"/>
           </w:tcPr>
           <w:p>
             <w:pPr>
@@ -1341,7 +1355,7 @@
         </w:tc>
         <w:tc>
           <w:tcPr>
-            <w:tcW w:type="dxa" w:w="2160"/>
+            <w:tcW w:type="dxa" w:w="1728"/>
           </w:tcPr>
           <w:p>
             <w:pPr>
@@ -1366,7 +1380,7 @@
       <w:tr>
         <w:tc>
           <w:tcPr>
-            <w:tcW w:type="dxa" w:w="2160"/>
+            <w:tcW w:type="dxa" w:w="1728"/>
           </w:tcPr>
           <w:p>
             <w:pPr>
@@ -1387,28 +1401,49 @@
         </w:tc>
         <w:tc>
           <w:tcPr>
-            <w:tcW w:type="dxa" w:w="2160"/>
-          </w:tcPr>
-          <w:p>
-            <w:pPr>
-              <w:spacing w:after="40" w:line="240" w:lineRule="auto"/>
-            </w:pPr>
-            <w:r>
-              <w:rPr>
-                <w:sz w:val="20"/>
-              </w:rPr>
-            </w:r>
-            <w:r>
-              <w:rPr>
-                <w:sz w:val="20"/>
-              </w:rPr>
-              <w:t>0.47</w:t>
-            </w:r>
-          </w:p>
-        </w:tc>
-        <w:tc>
-          <w:tcPr>
-            <w:tcW w:type="dxa" w:w="2160"/>
+            <w:tcW w:type="dxa" w:w="1728"/>
+          </w:tcPr>
+          <w:p>
+            <w:pPr>
+              <w:spacing w:after="40" w:line="240" w:lineRule="auto"/>
+            </w:pPr>
+            <w:r>
+              <w:rPr>
+                <w:sz w:val="20"/>
+              </w:rPr>
+            </w:r>
+            <w:r>
+              <w:rPr>
+                <w:sz w:val="20"/>
+              </w:rPr>
+              <w:t>0.723</w:t>
+            </w:r>
+          </w:p>
+        </w:tc>
+        <w:tc>
+          <w:tcPr>
+            <w:tcW w:type="dxa" w:w="1728"/>
+          </w:tcPr>
+          <w:p>
+            <w:pPr>
+              <w:spacing w:after="40" w:line="240" w:lineRule="auto"/>
+            </w:pPr>
+            <w:r>
+              <w:rPr>
+                <w:sz w:val="20"/>
+              </w:rPr>
+            </w:r>
+            <w:r>
+              <w:rPr>
+                <w:sz w:val="20"/>
+              </w:rPr>
+              <w:t>0.467</w:t>
+            </w:r>
+          </w:p>
+        </w:tc>
+        <w:tc>
+          <w:tcPr>
+            <w:tcW w:type="dxa" w:w="1728"/>
           </w:tcPr>
           <w:p>
             <w:pPr>
@@ -1429,22 +1464,22 @@
         </w:tc>
         <w:tc>
           <w:tcPr>
-            <w:tcW w:type="dxa" w:w="2160"/>
-          </w:tcPr>
-          <w:p>
-            <w:pPr>
-              <w:spacing w:after="40" w:line="240" w:lineRule="auto"/>
-            </w:pPr>
-            <w:r>
-              <w:rPr>
-                <w:sz w:val="20"/>
-              </w:rPr>
-            </w:r>
-            <w:r>
-              <w:rPr>
-                <w:sz w:val="20"/>
-              </w:rPr>
-              <w:t>0.42</w:t>
+            <w:tcW w:type="dxa" w:w="1728"/>
+          </w:tcPr>
+          <w:p>
+            <w:pPr>
+              <w:spacing w:after="40" w:line="240" w:lineRule="auto"/>
+            </w:pPr>
+            <w:r>
+              <w:rPr>
+                <w:sz w:val="20"/>
+              </w:rPr>
+            </w:r>
+            <w:r>
+              <w:rPr>
+                <w:sz w:val="20"/>
+              </w:rPr>
+              <w:t>0.394</w:t>
             </w:r>
           </w:p>
         </w:tc>
@@ -1452,7 +1487,7 @@
       <w:tr>
         <w:tc>
           <w:tcPr>
-            <w:tcW w:type="dxa" w:w="2160"/>
+            <w:tcW w:type="dxa" w:w="1728"/>
           </w:tcPr>
           <w:p>
             <w:pPr>
@@ -1473,64 +1508,85 @@
         </w:tc>
         <w:tc>
           <w:tcPr>
-            <w:tcW w:type="dxa" w:w="2160"/>
-          </w:tcPr>
-          <w:p>
-            <w:pPr>
-              <w:spacing w:after="40" w:line="240" w:lineRule="auto"/>
-            </w:pPr>
-            <w:r>
-              <w:rPr>
-                <w:sz w:val="20"/>
-              </w:rPr>
-            </w:r>
-            <w:r>
-              <w:rPr>
-                <w:sz w:val="20"/>
-              </w:rPr>
-              <w:t>0.56</w:t>
-            </w:r>
-          </w:p>
-        </w:tc>
-        <w:tc>
-          <w:tcPr>
-            <w:tcW w:type="dxa" w:w="2160"/>
-          </w:tcPr>
-          <w:p>
-            <w:pPr>
-              <w:spacing w:after="40" w:line="240" w:lineRule="auto"/>
-            </w:pPr>
-            <w:r>
-              <w:rPr>
-                <w:sz w:val="20"/>
-              </w:rPr>
-            </w:r>
-            <w:r>
-              <w:rPr>
-                <w:sz w:val="20"/>
-              </w:rPr>
-              <w:t>0.090</w:t>
-            </w:r>
-          </w:p>
-        </w:tc>
-        <w:tc>
-          <w:tcPr>
-            <w:tcW w:type="dxa" w:w="2160"/>
-          </w:tcPr>
-          <w:p>
-            <w:pPr>
-              <w:spacing w:after="40" w:line="240" w:lineRule="auto"/>
-            </w:pPr>
-            <w:r>
-              <w:rPr>
-                <w:sz w:val="20"/>
-              </w:rPr>
-            </w:r>
-            <w:r>
-              <w:rPr>
-                <w:sz w:val="20"/>
-              </w:rPr>
-              <w:t>0.48</w:t>
+            <w:tcW w:type="dxa" w:w="1728"/>
+          </w:tcPr>
+          <w:p>
+            <w:pPr>
+              <w:spacing w:after="40" w:line="240" w:lineRule="auto"/>
+            </w:pPr>
+            <w:r>
+              <w:rPr>
+                <w:sz w:val="20"/>
+              </w:rPr>
+            </w:r>
+            <w:r>
+              <w:rPr>
+                <w:sz w:val="20"/>
+              </w:rPr>
+              <w:t>0.613</w:t>
+            </w:r>
+          </w:p>
+        </w:tc>
+        <w:tc>
+          <w:tcPr>
+            <w:tcW w:type="dxa" w:w="1728"/>
+          </w:tcPr>
+          <w:p>
+            <w:pPr>
+              <w:spacing w:after="40" w:line="240" w:lineRule="auto"/>
+            </w:pPr>
+            <w:r>
+              <w:rPr>
+                <w:sz w:val="20"/>
+              </w:rPr>
+            </w:r>
+            <w:r>
+              <w:rPr>
+                <w:sz w:val="20"/>
+              </w:rPr>
+              <w:t>0.618</w:t>
+            </w:r>
+          </w:p>
+        </w:tc>
+        <w:tc>
+          <w:tcPr>
+            <w:tcW w:type="dxa" w:w="1728"/>
+          </w:tcPr>
+          <w:p>
+            <w:pPr>
+              <w:spacing w:after="40" w:line="240" w:lineRule="auto"/>
+            </w:pPr>
+            <w:r>
+              <w:rPr>
+                <w:sz w:val="20"/>
+              </w:rPr>
+            </w:r>
+            <w:r>
+              <w:rPr>
+                <w:sz w:val="20"/>
+              </w:rPr>
+              <w:t>0.151</w:t>
+            </w:r>
+          </w:p>
+        </w:tc>
+        <w:tc>
+          <w:tcPr>
+            <w:tcW w:type="dxa" w:w="1728"/>
+          </w:tcPr>
+          <w:p>
+            <w:pPr>
+              <w:spacing w:after="40" w:line="240" w:lineRule="auto"/>
+            </w:pPr>
+            <w:r>
+              <w:rPr>
+                <w:sz w:val="20"/>
+              </w:rPr>
+            </w:r>
+            <w:r>
+              <w:rPr>
+                <w:sz w:val="20"/>
+              </w:rPr>
+              <w:t>0.383</w:t>
             </w:r>
           </w:p>
         </w:tc>
@@ -1538,7 +1594,7 @@
       <w:tr>
         <w:tc>
           <w:tcPr>
-            <w:tcW w:type="dxa" w:w="2160"/>
+            <w:tcW w:type="dxa" w:w="1728"/>
           </w:tcPr>
           <w:p>
             <w:pPr>
@@ -1559,64 +1615,85 @@
         </w:tc>
         <w:tc>
           <w:tcPr>
-            <w:tcW w:type="dxa" w:w="2160"/>
-          </w:tcPr>
-          <w:p>
-            <w:pPr>
-              <w:spacing w:after="40" w:line="240" w:lineRule="auto"/>
-            </w:pPr>
-            <w:r>
-              <w:rPr>
-                <w:sz w:val="20"/>
-              </w:rPr>
-            </w:r>
-            <w:r>
-              <w:rPr>
-                <w:sz w:val="20"/>
-              </w:rPr>
-              <w:t>0.63</w:t>
-            </w:r>
-          </w:p>
-        </w:tc>
-        <w:tc>
-          <w:tcPr>
-            <w:tcW w:type="dxa" w:w="2160"/>
-          </w:tcPr>
-          <w:p>
-            <w:pPr>
-              <w:spacing w:after="40" w:line="240" w:lineRule="auto"/>
-            </w:pPr>
-            <w:r>
-              <w:rPr>
-                <w:sz w:val="20"/>
-              </w:rPr>
-            </w:r>
-            <w:r>
-              <w:rPr>
-                <w:sz w:val="20"/>
-              </w:rPr>
-              <w:t>0.070</w:t>
-            </w:r>
-          </w:p>
-        </w:tc>
-        <w:tc>
-          <w:tcPr>
-            <w:tcW w:type="dxa" w:w="2160"/>
-          </w:tcPr>
-          <w:p>
-            <w:pPr>
-              <w:spacing w:after="40" w:line="240" w:lineRule="auto"/>
-            </w:pPr>
-            <w:r>
-              <w:rPr>
-                <w:sz w:val="20"/>
-              </w:rPr>
-            </w:r>
-            <w:r>
-              <w:rPr>
-                <w:sz w:val="20"/>
-              </w:rPr>
-              <w:t>0.53</w:t>
+            <w:tcW w:type="dxa" w:w="1728"/>
+          </w:tcPr>
+          <w:p>
+            <w:pPr>
+              <w:spacing w:after="40" w:line="240" w:lineRule="auto"/>
+            </w:pPr>
+            <w:r>
+              <w:rPr>
+                <w:sz w:val="20"/>
+              </w:rPr>
+            </w:r>
+            <w:r>
+              <w:rPr>
+                <w:sz w:val="20"/>
+              </w:rPr>
+              <w:t>0.556</w:t>
+            </w:r>
+          </w:p>
+        </w:tc>
+        <w:tc>
+          <w:tcPr>
+            <w:tcW w:type="dxa" w:w="1728"/>
+          </w:tcPr>
+          <w:p>
+            <w:pPr>
+              <w:spacing w:after="40" w:line="240" w:lineRule="auto"/>
+            </w:pPr>
+            <w:r>
+              <w:rPr>
+                <w:sz w:val="20"/>
+              </w:rPr>
+            </w:r>
+            <w:r>
+              <w:rPr>
+                <w:sz w:val="20"/>
+              </w:rPr>
+              <w:t>0.685</w:t>
+            </w:r>
+          </w:p>
+        </w:tc>
+        <w:tc>
+          <w:tcPr>
+            <w:tcW w:type="dxa" w:w="1728"/>
+          </w:tcPr>
+          <w:p>
+            <w:pPr>
+              <w:spacing w:after="40" w:line="240" w:lineRule="auto"/>
+            </w:pPr>
+            <w:r>
+              <w:rPr>
+                <w:sz w:val="20"/>
+              </w:rPr>
+            </w:r>
+            <w:r>
+              <w:rPr>
+                <w:sz w:val="20"/>
+              </w:rPr>
+              <w:t>0.068</w:t>
+            </w:r>
+          </w:p>
+        </w:tc>
+        <w:tc>
+          <w:tcPr>
+            <w:tcW w:type="dxa" w:w="1728"/>
+          </w:tcPr>
+          <w:p>
+            <w:pPr>
+              <w:spacing w:after="40" w:line="240" w:lineRule="auto"/>
+            </w:pPr>
+            <w:r>
+              <w:rPr>
+                <w:sz w:val="20"/>
+              </w:rPr>
+            </w:r>
+            <w:r>
+              <w:rPr>
+                <w:sz w:val="20"/>
+              </w:rPr>
+              <w:t>0.430</w:t>
             </w:r>
           </w:p>
         </w:tc>
@@ -1624,7 +1701,7 @@
       <w:tr>
         <w:tc>
           <w:tcPr>
-            <w:tcW w:type="dxa" w:w="2160"/>
+            <w:tcW w:type="dxa" w:w="1728"/>
           </w:tcPr>
           <w:p>
             <w:pPr>
@@ -1645,28 +1722,49 @@
         </w:tc>
         <w:tc>
           <w:tcPr>
-            <w:tcW w:type="dxa" w:w="2160"/>
-          </w:tcPr>
-          <w:p>
-            <w:pPr>
-              <w:spacing w:after="40" w:line="240" w:lineRule="auto"/>
-            </w:pPr>
-            <w:r>
-              <w:rPr>
-                <w:sz w:val="20"/>
-              </w:rPr>
-            </w:r>
-            <w:r>
-              <w:rPr>
-                <w:sz w:val="20"/>
-              </w:rPr>
-              <w:t>0.70</w:t>
-            </w:r>
-          </w:p>
-        </w:tc>
-        <w:tc>
-          <w:tcPr>
-            <w:tcW w:type="dxa" w:w="2160"/>
+            <w:tcW w:type="dxa" w:w="1728"/>
+          </w:tcPr>
+          <w:p>
+            <w:pPr>
+              <w:spacing w:after="40" w:line="240" w:lineRule="auto"/>
+            </w:pPr>
+            <w:r>
+              <w:rPr>
+                <w:sz w:val="20"/>
+              </w:rPr>
+            </w:r>
+            <w:r>
+              <w:rPr>
+                <w:sz w:val="20"/>
+              </w:rPr>
+              <w:t>0.537</w:t>
+            </w:r>
+          </w:p>
+        </w:tc>
+        <w:tc>
+          <w:tcPr>
+            <w:tcW w:type="dxa" w:w="1728"/>
+          </w:tcPr>
+          <w:p>
+            <w:pPr>
+              <w:spacing w:after="40" w:line="240" w:lineRule="auto"/>
+            </w:pPr>
+            <w:r>
+              <w:rPr>
+                <w:sz w:val="20"/>
+              </w:rPr>
+            </w:r>
+            <w:r>
+              <w:rPr>
+                <w:sz w:val="20"/>
+              </w:rPr>
+              <w:t>0.707</w:t>
+            </w:r>
+          </w:p>
+        </w:tc>
+        <w:tc>
+          <w:tcPr>
+            <w:tcW w:type="dxa" w:w="1728"/>
           </w:tcPr>
           <w:p>
             <w:pPr>
@@ -1687,22 +1785,22 @@
         </w:tc>
         <w:tc>
           <w:tcPr>
-            <w:tcW w:type="dxa" w:w="2160"/>
-          </w:tcPr>
-          <w:p>
-            <w:pPr>
-              <w:spacing w:after="40" w:line="240" w:lineRule="auto"/>
-            </w:pPr>
-            <w:r>
-              <w:rPr>
-                <w:sz w:val="20"/>
-              </w:rPr>
-            </w:r>
-            <w:r>
-              <w:rPr>
-                <w:sz w:val="20"/>
-              </w:rPr>
-              <w:t>0.57</w:t>
+            <w:tcW w:type="dxa" w:w="1728"/>
+          </w:tcPr>
+          <w:p>
+            <w:pPr>
+              <w:spacing w:after="40" w:line="240" w:lineRule="auto"/>
+            </w:pPr>
+            <w:r>
+              <w:rPr>
+                <w:sz w:val="20"/>
+              </w:rPr>
+            </w:r>
+            <w:r>
+              <w:rPr>
+                <w:sz w:val="20"/>
+              </w:rPr>
+              <w:t>0.449</w:t>
             </w:r>
           </w:p>
         </w:tc>
@@ -1710,7 +1808,7 @@
       <w:tr>
         <w:tc>
           <w:tcPr>
-            <w:tcW w:type="dxa" w:w="2160"/>
+            <w:tcW w:type="dxa" w:w="1728"/>
           </w:tcPr>
           <w:p>
             <w:pPr>
@@ -1731,64 +1829,85 @@
         </w:tc>
         <w:tc>
           <w:tcPr>
-            <w:tcW w:type="dxa" w:w="2160"/>
-          </w:tcPr>
-          <w:p>
-            <w:pPr>
-              <w:spacing w:after="40" w:line="240" w:lineRule="auto"/>
-            </w:pPr>
-            <w:r>
-              <w:rPr>
-                <w:sz w:val="20"/>
-              </w:rPr>
-            </w:r>
-            <w:r>
-              <w:rPr>
-                <w:sz w:val="20"/>
-              </w:rPr>
-              <w:t>0.75</w:t>
-            </w:r>
-          </w:p>
-        </w:tc>
-        <w:tc>
-          <w:tcPr>
-            <w:tcW w:type="dxa" w:w="2160"/>
-          </w:tcPr>
-          <w:p>
-            <w:pPr>
-              <w:spacing w:after="40" w:line="240" w:lineRule="auto"/>
-            </w:pPr>
-            <w:r>
-              <w:rPr>
-                <w:sz w:val="20"/>
-              </w:rPr>
-            </w:r>
-            <w:r>
-              <w:rPr>
-                <w:sz w:val="20"/>
-              </w:rPr>
-              <w:t>0.050</w:t>
-            </w:r>
-          </w:p>
-        </w:tc>
-        <w:tc>
-          <w:tcPr>
-            <w:tcW w:type="dxa" w:w="2160"/>
-          </w:tcPr>
-          <w:p>
-            <w:pPr>
-              <w:spacing w:after="40" w:line="240" w:lineRule="auto"/>
-            </w:pPr>
-            <w:r>
-              <w:rPr>
-                <w:sz w:val="20"/>
-              </w:rPr>
-            </w:r>
-            <w:r>
-              <w:rPr>
-                <w:sz w:val="20"/>
-              </w:rPr>
-              <w:t>0.60</w:t>
+            <w:tcW w:type="dxa" w:w="1728"/>
+          </w:tcPr>
+          <w:p>
+            <w:pPr>
+              <w:spacing w:after="40" w:line="240" w:lineRule="auto"/>
+            </w:pPr>
+            <w:r>
+              <w:rPr>
+                <w:sz w:val="20"/>
+              </w:rPr>
+            </w:r>
+            <w:r>
+              <w:rPr>
+                <w:sz w:val="20"/>
+              </w:rPr>
+              <w:t>0.502</w:t>
+            </w:r>
+          </w:p>
+        </w:tc>
+        <w:tc>
+          <w:tcPr>
+            <w:tcW w:type="dxa" w:w="1728"/>
+          </w:tcPr>
+          <w:p>
+            <w:pPr>
+              <w:spacing w:after="40" w:line="240" w:lineRule="auto"/>
+            </w:pPr>
+            <w:r>
+              <w:rPr>
+                <w:sz w:val="20"/>
+              </w:rPr>
+            </w:r>
+            <w:r>
+              <w:rPr>
+                <w:sz w:val="20"/>
+              </w:rPr>
+              <w:t>0.744</w:t>
+            </w:r>
+          </w:p>
+        </w:tc>
+        <w:tc>
+          <w:tcPr>
+            <w:tcW w:type="dxa" w:w="1728"/>
+          </w:tcPr>
+          <w:p>
+            <w:pPr>
+              <w:spacing w:after="40" w:line="240" w:lineRule="auto"/>
+            </w:pPr>
+            <w:r>
+              <w:rPr>
+                <w:sz w:val="20"/>
+              </w:rPr>
+            </w:r>
+            <w:r>
+              <w:rPr>
+                <w:sz w:val="20"/>
+              </w:rPr>
+              <w:t>0.037</w:t>
+            </w:r>
+          </w:p>
+        </w:tc>
+        <w:tc>
+          <w:tcPr>
+            <w:tcW w:type="dxa" w:w="1728"/>
+          </w:tcPr>
+          <w:p>
+            <w:pPr>
+              <w:spacing w:after="40" w:line="240" w:lineRule="auto"/>
+            </w:pPr>
+            <w:r>
+              <w:rPr>
+                <w:sz w:val="20"/>
+              </w:rPr>
+            </w:r>
+            <w:r>
+              <w:rPr>
+                <w:sz w:val="20"/>
+              </w:rPr>
+              <w:t>0.452</w:t>
             </w:r>
           </w:p>
         </w:tc>
@@ -1796,7 +1915,7 @@
       <w:tr>
         <w:tc>
           <w:tcPr>
-            <w:tcW w:type="dxa" w:w="2160"/>
+            <w:tcW w:type="dxa" w:w="1728"/>
           </w:tcPr>
           <w:p>
             <w:pPr>
@@ -1817,64 +1936,85 @@
         </w:tc>
         <w:tc>
           <w:tcPr>
-            <w:tcW w:type="dxa" w:w="2160"/>
-          </w:tcPr>
-          <w:p>
-            <w:pPr>
-              <w:spacing w:after="40" w:line="240" w:lineRule="auto"/>
-            </w:pPr>
-            <w:r>
-              <w:rPr>
-                <w:sz w:val="20"/>
-              </w:rPr>
-            </w:r>
-            <w:r>
-              <w:rPr>
-                <w:sz w:val="20"/>
-              </w:rPr>
-              <w:t>0.76</w:t>
-            </w:r>
-          </w:p>
-        </w:tc>
-        <w:tc>
-          <w:tcPr>
-            <w:tcW w:type="dxa" w:w="2160"/>
-          </w:tcPr>
-          <w:p>
-            <w:pPr>
-              <w:spacing w:after="40" w:line="240" w:lineRule="auto"/>
-            </w:pPr>
-            <w:r>
-              <w:rPr>
-                <w:sz w:val="20"/>
-              </w:rPr>
-            </w:r>
-            <w:r>
-              <w:rPr>
-                <w:sz w:val="20"/>
-              </w:rPr>
-              <w:t>0.010</w:t>
-            </w:r>
-          </w:p>
-        </w:tc>
-        <w:tc>
-          <w:tcPr>
-            <w:tcW w:type="dxa" w:w="2160"/>
-          </w:tcPr>
-          <w:p>
-            <w:pPr>
-              <w:spacing w:after="40" w:line="240" w:lineRule="auto"/>
-            </w:pPr>
-            <w:r>
-              <w:rPr>
-                <w:sz w:val="20"/>
-              </w:rPr>
-            </w:r>
-            <w:r>
-              <w:rPr>
-                <w:sz w:val="20"/>
-              </w:rPr>
-              <w:t>0.63</w:t>
+            <w:tcW w:type="dxa" w:w="1728"/>
+          </w:tcPr>
+          <w:p>
+            <w:pPr>
+              <w:spacing w:after="40" w:line="240" w:lineRule="auto"/>
+            </w:pPr>
+            <w:r>
+              <w:rPr>
+                <w:sz w:val="20"/>
+              </w:rPr>
+            </w:r>
+            <w:r>
+              <w:rPr>
+                <w:sz w:val="20"/>
+              </w:rPr>
+              <w:t>0.469</w:t>
+            </w:r>
+          </w:p>
+        </w:tc>
+        <w:tc>
+          <w:tcPr>
+            <w:tcW w:type="dxa" w:w="1728"/>
+          </w:tcPr>
+          <w:p>
+            <w:pPr>
+              <w:spacing w:after="40" w:line="240" w:lineRule="auto"/>
+            </w:pPr>
+            <w:r>
+              <w:rPr>
+                <w:sz w:val="20"/>
+              </w:rPr>
+            </w:r>
+            <w:r>
+              <w:rPr>
+                <w:sz w:val="20"/>
+              </w:rPr>
+              <w:t>0.776</w:t>
+            </w:r>
+          </w:p>
+        </w:tc>
+        <w:tc>
+          <w:tcPr>
+            <w:tcW w:type="dxa" w:w="1728"/>
+          </w:tcPr>
+          <w:p>
+            <w:pPr>
+              <w:spacing w:after="40" w:line="240" w:lineRule="auto"/>
+            </w:pPr>
+            <w:r>
+              <w:rPr>
+                <w:sz w:val="20"/>
+              </w:rPr>
+            </w:r>
+            <w:r>
+              <w:rPr>
+                <w:sz w:val="20"/>
+              </w:rPr>
+              <w:t>0.032</w:t>
+            </w:r>
+          </w:p>
+        </w:tc>
+        <w:tc>
+          <w:tcPr>
+            <w:tcW w:type="dxa" w:w="1728"/>
+          </w:tcPr>
+          <w:p>
+            <w:pPr>
+              <w:spacing w:after="40" w:line="240" w:lineRule="auto"/>
+            </w:pPr>
+            <w:r>
+              <w:rPr>
+                <w:sz w:val="20"/>
+              </w:rPr>
+            </w:r>
+            <w:r>
+              <w:rPr>
+                <w:sz w:val="20"/>
+              </w:rPr>
+              <w:t>0.447</w:t>
             </w:r>
           </w:p>
         </w:tc>
@@ -1882,7 +2022,7 @@
       <w:tr>
         <w:tc>
           <w:tcPr>
-            <w:tcW w:type="dxa" w:w="2160"/>
+            <w:tcW w:type="dxa" w:w="1728"/>
           </w:tcPr>
           <w:p>
             <w:pPr>
@@ -1903,64 +2043,85 @@
         </w:tc>
         <w:tc>
           <w:tcPr>
-            <w:tcW w:type="dxa" w:w="2160"/>
-          </w:tcPr>
-          <w:p>
-            <w:pPr>
-              <w:spacing w:after="40" w:line="240" w:lineRule="auto"/>
-            </w:pPr>
-            <w:r>
-              <w:rPr>
-                <w:sz w:val="20"/>
-              </w:rPr>
-            </w:r>
-            <w:r>
-              <w:rPr>
-                <w:sz w:val="20"/>
-              </w:rPr>
-              <w:t>0.78</w:t>
-            </w:r>
-          </w:p>
-        </w:tc>
-        <w:tc>
-          <w:tcPr>
-            <w:tcW w:type="dxa" w:w="2160"/>
-          </w:tcPr>
-          <w:p>
-            <w:pPr>
-              <w:spacing w:after="40" w:line="240" w:lineRule="auto"/>
-            </w:pPr>
-            <w:r>
-              <w:rPr>
-                <w:sz w:val="20"/>
-              </w:rPr>
-            </w:r>
-            <w:r>
-              <w:rPr>
-                <w:sz w:val="20"/>
-              </w:rPr>
-              <w:t>0.020</w:t>
-            </w:r>
-          </w:p>
-        </w:tc>
-        <w:tc>
-          <w:tcPr>
-            <w:tcW w:type="dxa" w:w="2160"/>
-          </w:tcPr>
-          <w:p>
-            <w:pPr>
-              <w:spacing w:after="40" w:line="240" w:lineRule="auto"/>
-            </w:pPr>
-            <w:r>
-              <w:rPr>
-                <w:sz w:val="20"/>
-              </w:rPr>
-            </w:r>
-            <w:r>
-              <w:rPr>
-                <w:sz w:val="20"/>
-              </w:rPr>
-              <w:t>0.65</w:t>
+            <w:tcW w:type="dxa" w:w="1728"/>
+          </w:tcPr>
+          <w:p>
+            <w:pPr>
+              <w:spacing w:after="40" w:line="240" w:lineRule="auto"/>
+            </w:pPr>
+            <w:r>
+              <w:rPr>
+                <w:sz w:val="20"/>
+              </w:rPr>
+            </w:r>
+            <w:r>
+              <w:rPr>
+                <w:sz w:val="20"/>
+              </w:rPr>
+              <w:t>0.458</w:t>
+            </w:r>
+          </w:p>
+        </w:tc>
+        <w:tc>
+          <w:tcPr>
+            <w:tcW w:type="dxa" w:w="1728"/>
+          </w:tcPr>
+          <w:p>
+            <w:pPr>
+              <w:spacing w:after="40" w:line="240" w:lineRule="auto"/>
+            </w:pPr>
+            <w:r>
+              <w:rPr>
+                <w:sz w:val="20"/>
+              </w:rPr>
+            </w:r>
+            <w:r>
+              <w:rPr>
+                <w:sz w:val="20"/>
+              </w:rPr>
+              <w:t>0.787</w:t>
+            </w:r>
+          </w:p>
+        </w:tc>
+        <w:tc>
+          <w:tcPr>
+            <w:tcW w:type="dxa" w:w="1728"/>
+          </w:tcPr>
+          <w:p>
+            <w:pPr>
+              <w:spacing w:after="40" w:line="240" w:lineRule="auto"/>
+            </w:pPr>
+            <w:r>
+              <w:rPr>
+                <w:sz w:val="20"/>
+              </w:rPr>
+            </w:r>
+            <w:r>
+              <w:rPr>
+                <w:sz w:val="20"/>
+              </w:rPr>
+              <w:t>0.011</w:t>
+            </w:r>
+          </w:p>
+        </w:tc>
+        <w:tc>
+          <w:tcPr>
+            <w:tcW w:type="dxa" w:w="1728"/>
+          </w:tcPr>
+          <w:p>
+            <w:pPr>
+              <w:spacing w:after="40" w:line="240" w:lineRule="auto"/>
+            </w:pPr>
+            <w:r>
+              <w:rPr>
+                <w:sz w:val="20"/>
+              </w:rPr>
+            </w:r>
+            <w:r>
+              <w:rPr>
+                <w:sz w:val="20"/>
+              </w:rPr>
+              <w:t>0.457</w:t>
             </w:r>
           </w:p>
         </w:tc>
@@ -1968,7 +2129,7 @@
       <w:tr>
         <w:tc>
           <w:tcPr>
-            <w:tcW w:type="dxa" w:w="2160"/>
+            <w:tcW w:type="dxa" w:w="1728"/>
           </w:tcPr>
           <w:p>
             <w:pPr>
@@ -1989,64 +2150,85 @@
         </w:tc>
         <w:tc>
           <w:tcPr>
-            <w:tcW w:type="dxa" w:w="2160"/>
-          </w:tcPr>
-          <w:p>
-            <w:pPr>
-              <w:spacing w:after="40" w:line="240" w:lineRule="auto"/>
-            </w:pPr>
-            <w:r>
-              <w:rPr>
-                <w:sz w:val="20"/>
-              </w:rPr>
-            </w:r>
-            <w:r>
-              <w:rPr>
-                <w:sz w:val="20"/>
-              </w:rPr>
-              <w:t>0.79</w:t>
-            </w:r>
-          </w:p>
-        </w:tc>
-        <w:tc>
-          <w:tcPr>
-            <w:tcW w:type="dxa" w:w="2160"/>
-          </w:tcPr>
-          <w:p>
-            <w:pPr>
-              <w:spacing w:after="40" w:line="240" w:lineRule="auto"/>
-            </w:pPr>
-            <w:r>
-              <w:rPr>
-                <w:sz w:val="20"/>
-              </w:rPr>
-            </w:r>
-            <w:r>
-              <w:rPr>
-                <w:sz w:val="20"/>
-              </w:rPr>
-              <w:t>0.010</w:t>
-            </w:r>
-          </w:p>
-        </w:tc>
-        <w:tc>
-          <w:tcPr>
-            <w:tcW w:type="dxa" w:w="2160"/>
-          </w:tcPr>
-          <w:p>
-            <w:pPr>
-              <w:spacing w:after="40" w:line="240" w:lineRule="auto"/>
-            </w:pPr>
-            <w:r>
-              <w:rPr>
-                <w:sz w:val="20"/>
-              </w:rPr>
-            </w:r>
-            <w:r>
-              <w:rPr>
-                <w:sz w:val="20"/>
-              </w:rPr>
-              <w:t>0.67</w:t>
+            <w:tcW w:type="dxa" w:w="1728"/>
+          </w:tcPr>
+          <w:p>
+            <w:pPr>
+              <w:spacing w:after="40" w:line="240" w:lineRule="auto"/>
+            </w:pPr>
+            <w:r>
+              <w:rPr>
+                <w:sz w:val="20"/>
+              </w:rPr>
+            </w:r>
+            <w:r>
+              <w:rPr>
+                <w:sz w:val="20"/>
+              </w:rPr>
+              <w:t>0.438</w:t>
+            </w:r>
+          </w:p>
+        </w:tc>
+        <w:tc>
+          <w:tcPr>
+            <w:tcW w:type="dxa" w:w="1728"/>
+          </w:tcPr>
+          <w:p>
+            <w:pPr>
+              <w:spacing w:after="40" w:line="240" w:lineRule="auto"/>
+            </w:pPr>
+            <w:r>
+              <w:rPr>
+                <w:sz w:val="20"/>
+              </w:rPr>
+            </w:r>
+            <w:r>
+              <w:rPr>
+                <w:sz w:val="20"/>
+              </w:rPr>
+              <w:t>0.805</w:t>
+            </w:r>
+          </w:p>
+        </w:tc>
+        <w:tc>
+          <w:tcPr>
+            <w:tcW w:type="dxa" w:w="1728"/>
+          </w:tcPr>
+          <w:p>
+            <w:pPr>
+              <w:spacing w:after="40" w:line="240" w:lineRule="auto"/>
+            </w:pPr>
+            <w:r>
+              <w:rPr>
+                <w:sz w:val="20"/>
+              </w:rPr>
+            </w:r>
+            <w:r>
+              <w:rPr>
+                <w:sz w:val="20"/>
+              </w:rPr>
+              <w:t>0.018</w:t>
+            </w:r>
+          </w:p>
+        </w:tc>
+        <w:tc>
+          <w:tcPr>
+            <w:tcW w:type="dxa" w:w="1728"/>
+          </w:tcPr>
+          <w:p>
+            <w:pPr>
+              <w:spacing w:after="40" w:line="240" w:lineRule="auto"/>
+            </w:pPr>
+            <w:r>
+              <w:rPr>
+                <w:sz w:val="20"/>
+              </w:rPr>
+            </w:r>
+            <w:r>
+              <w:rPr>
+                <w:sz w:val="20"/>
+              </w:rPr>
+              <w:t>0.474</w:t>
             </w:r>
           </w:p>
         </w:tc>
@@ -2054,7 +2236,7 @@
       <w:tr>
         <w:tc>
           <w:tcPr>
-            <w:tcW w:type="dxa" w:w="2160"/>
+            <w:tcW w:type="dxa" w:w="1728"/>
           </w:tcPr>
           <w:p>
             <w:pPr>
@@ -2075,64 +2257,85 @@
         </w:tc>
         <w:tc>
           <w:tcPr>
-            <w:tcW w:type="dxa" w:w="2160"/>
-          </w:tcPr>
-          <w:p>
-            <w:pPr>
-              <w:spacing w:after="40" w:line="240" w:lineRule="auto"/>
-            </w:pPr>
-            <w:r>
-              <w:rPr>
-                <w:sz w:val="20"/>
-              </w:rPr>
-            </w:r>
-            <w:r>
-              <w:rPr>
-                <w:sz w:val="20"/>
-              </w:rPr>
-              <w:t>0.80</w:t>
-            </w:r>
-          </w:p>
-        </w:tc>
-        <w:tc>
-          <w:tcPr>
-            <w:tcW w:type="dxa" w:w="2160"/>
-          </w:tcPr>
-          <w:p>
-            <w:pPr>
-              <w:spacing w:after="40" w:line="240" w:lineRule="auto"/>
-            </w:pPr>
-            <w:r>
-              <w:rPr>
-                <w:sz w:val="20"/>
-              </w:rPr>
-            </w:r>
-            <w:r>
-              <w:rPr>
-                <w:sz w:val="20"/>
-              </w:rPr>
-              <w:t>0.010</w:t>
-            </w:r>
-          </w:p>
-        </w:tc>
-        <w:tc>
-          <w:tcPr>
-            <w:tcW w:type="dxa" w:w="2160"/>
-          </w:tcPr>
-          <w:p>
-            <w:pPr>
-              <w:spacing w:after="40" w:line="240" w:lineRule="auto"/>
-            </w:pPr>
-            <w:r>
-              <w:rPr>
-                <w:sz w:val="20"/>
-              </w:rPr>
-            </w:r>
-            <w:r>
-              <w:rPr>
-                <w:sz w:val="20"/>
-              </w:rPr>
-              <w:t>0.69</w:t>
+            <w:tcW w:type="dxa" w:w="1728"/>
+          </w:tcPr>
+          <w:p>
+            <w:pPr>
+              <w:spacing w:after="40" w:line="240" w:lineRule="auto"/>
+            </w:pPr>
+            <w:r>
+              <w:rPr>
+                <w:sz w:val="20"/>
+              </w:rPr>
+            </w:r>
+            <w:r>
+              <w:rPr>
+                <w:sz w:val="20"/>
+              </w:rPr>
+              <w:t>0.420</w:t>
+            </w:r>
+          </w:p>
+        </w:tc>
+        <w:tc>
+          <w:tcPr>
+            <w:tcW w:type="dxa" w:w="1728"/>
+          </w:tcPr>
+          <w:p>
+            <w:pPr>
+              <w:spacing w:after="40" w:line="240" w:lineRule="auto"/>
+            </w:pPr>
+            <w:r>
+              <w:rPr>
+                <w:sz w:val="20"/>
+              </w:rPr>
+            </w:r>
+            <w:r>
+              <w:rPr>
+                <w:sz w:val="20"/>
+              </w:rPr>
+              <w:t>0.820</w:t>
+            </w:r>
+          </w:p>
+        </w:tc>
+        <w:tc>
+          <w:tcPr>
+            <w:tcW w:type="dxa" w:w="1728"/>
+          </w:tcPr>
+          <w:p>
+            <w:pPr>
+              <w:spacing w:after="40" w:line="240" w:lineRule="auto"/>
+            </w:pPr>
+            <w:r>
+              <w:rPr>
+                <w:sz w:val="20"/>
+              </w:rPr>
+            </w:r>
+            <w:r>
+              <w:rPr>
+                <w:sz w:val="20"/>
+              </w:rPr>
+              <w:t>0.015</w:t>
+            </w:r>
+          </w:p>
+        </w:tc>
+        <w:tc>
+          <w:tcPr>
+            <w:tcW w:type="dxa" w:w="1728"/>
+          </w:tcPr>
+          <w:p>
+            <w:pPr>
+              <w:spacing w:after="40" w:line="240" w:lineRule="auto"/>
+            </w:pPr>
+            <w:r>
+              <w:rPr>
+                <w:sz w:val="20"/>
+              </w:rPr>
+            </w:r>
+            <w:r>
+              <w:rPr>
+                <w:sz w:val="20"/>
+              </w:rPr>
+              <w:t>0.466</w:t>
             </w:r>
           </w:p>
         </w:tc>
@@ -2148,7 +2351,7 @@
           <w:i/>
           <w:sz w:val="20"/>
         </w:rPr>
-        <w:t xml:space="preserve">Note: The </w:t>
+        <w:t xml:space="preserve">Note: Variance explained increases smoothly with </w:t>
       </w:r>
       <w:r>
         <w:rPr>
@@ -2163,7 +2366,67 @@
           <w:i/>
           <w:sz w:val="20"/>
         </w:rPr>
-        <w:t xml:space="preserve"> = 6 row reports results from the final 10-initialisation fit (</w:t>
+        <w:t xml:space="preserve"> and the marginal gain does not isolate a single optimal rank (it is non-monotonic, with local values of 0.021 at </w:t>
+      </w:r>
+      <w:r>
+        <w:rPr>
+          <w:b w:val="0"/>
+          <w:i/>
+          <w:sz w:val="20"/>
+        </w:rPr>
+        <w:t>K</w:t>
+      </w:r>
+      <w:r>
+        <w:rPr>
+          <w:i/>
+          <w:sz w:val="20"/>
+        </w:rPr>
+        <w:t xml:space="preserve"> = 5 and 0.037 at </w:t>
+      </w:r>
+      <w:r>
+        <w:rPr>
+          <w:b w:val="0"/>
+          <w:i/>
+          <w:sz w:val="20"/>
+        </w:rPr>
+        <w:t>K</w:t>
+      </w:r>
+      <w:r>
+        <w:rPr>
+          <w:i/>
+          <w:sz w:val="20"/>
+        </w:rPr>
+        <w:t xml:space="preserve"> = 6): there is no sharp elbow. </w:t>
+      </w:r>
+      <w:r>
+        <w:rPr>
+          <w:b w:val="0"/>
+          <w:i/>
+          <w:sz w:val="20"/>
+        </w:rPr>
+        <w:t>K</w:t>
+      </w:r>
+      <w:r>
+        <w:rPr>
+          <w:i/>
+          <w:sz w:val="20"/>
+        </w:rPr>
+        <w:t xml:space="preserve"> = 6 is therefore selected on interpretability grounds rather than from a statistical break (Section 3.4.2). The production </w:t>
+      </w:r>
+      <w:r>
+        <w:rPr>
+          <w:b w:val="0"/>
+          <w:i/>
+          <w:sz w:val="20"/>
+        </w:rPr>
+        <w:t>K</w:t>
+      </w:r>
+      <w:r>
+        <w:rPr>
+          <w:i/>
+          <w:sz w:val="20"/>
+        </w:rPr>
+        <w:t xml:space="preserve"> = 6 model reported in the main text was subsequently refitted with ten random initialisations, yielding </w:t>
       </w:r>
       <w:r>
         <w:rPr>
@@ -2178,67 +2441,7 @@
           <w:i/>
           <w:sz w:val="20"/>
         </w:rPr>
-        <w:t>² = 0.75), which improves upon the 3-initialisation screening (</w:t>
-      </w:r>
-      <w:r>
-        <w:rPr>
-          <w:b w:val="0"/>
-          <w:i/>
-          <w:sz w:val="20"/>
-        </w:rPr>
-        <w:t>R</w:t>
-      </w:r>
-      <w:r>
-        <w:rPr>
-          <w:i/>
-          <w:sz w:val="20"/>
-        </w:rPr>
-        <w:t xml:space="preserve">² = 0.74). The marginal </w:t>
-      </w:r>
-      <w:r>
-        <w:rPr>
-          <w:b w:val="0"/>
-          <w:i/>
-          <w:sz w:val="20"/>
-        </w:rPr>
-        <w:t>R</w:t>
-      </w:r>
-      <w:r>
-        <w:rPr>
-          <w:i/>
-          <w:sz w:val="20"/>
-        </w:rPr>
-        <w:t xml:space="preserve">² gain is computed relative to </w:t>
-      </w:r>
-      <w:r>
-        <w:rPr>
-          <w:b w:val="0"/>
-          <w:i/>
-          <w:sz w:val="20"/>
-        </w:rPr>
-        <w:t>K</w:t>
-      </w:r>
-      <w:r>
-        <w:rPr>
-          <w:i/>
-          <w:sz w:val="20"/>
-        </w:rPr>
-        <w:t xml:space="preserve"> = 5 using the final model value; subsequent ranks (</w:t>
-      </w:r>
-      <w:r>
-        <w:rPr>
-          <w:b w:val="0"/>
-          <w:i/>
-          <w:sz w:val="20"/>
-        </w:rPr>
-        <w:t>K</w:t>
-      </w:r>
-      <w:r>
-        <w:rPr>
-          <w:i/>
-          <w:sz w:val="20"/>
-        </w:rPr>
-        <w:t xml:space="preserve"> = 7–10) use 3-initialisation screening values.</w:t>
+        <w:t>² = 0.752, marginally above the 0.744 screening value tabulated here; this refit affects only the final model, not the comparison across ranks.</w:t>
       </w:r>
     </w:p>
     <w:p>
@@ -3210,7 +3413,7 @@
     </w:p>
     <w:p>
       <w:r>
-        <w:t>For each NTF component, the principal tariff concessions were identified from the agreement's factsheets — quota volumes, applicable tariff rates, and the magnitude of the tariff reduction. The component receiving the largest combined concession — C5 (livestock), with a beef quota representing approximately a 32 percentage point reduction from the prevailing tariff (European Commission 2024b) — was assigned the highest shock parameter (δ = +15% for MERCOSUR exports to EU). The remaining components were scaled relative to C5 in proportion to the magnitude and tradability of their respective concessions.</w:t>
+        <w:t>For each NTF component, the principal tariff concessions were identified from the agreement's factsheets — quota volumes, applicable tariff rates, and the magnitude of the tariff reduction. The component receiving the largest combined concession — C5 (livestock), with a beef quota representing approximately a 32 percentage point reduction from the prevailing tariff (European Commission, 2024b) — was assigned the highest shock parameter (δ = +15% for MERCOSUR exports to EU). The remaining components were scaled relative to C5 in proportion to the magnitude and tradability of their respective concessions.</w:t>
       </w:r>
     </w:p>
     <w:tbl>
@@ -4155,12 +4358,12 @@
         <w:pStyle w:val="Heading2"/>
       </w:pPr>
       <w:r>
-        <w:t>Table S5. Sector-level impact: top 20 sectors by projected agreement effect</w:t>
+        <w:t>Table S5. Sector-level effect under the central scenario: top 20 sectors</w:t>
       </w:r>
     </w:p>
     <w:p>
       <w:r>
-        <w:t>Projected agreement-induced increase in material extraction by sector, computed as the percentage change between agreement and baseline scenarios at 2034 (full implementation). Percentage effects are symmetric across blocs because the tariff shock operates on shared temporal loadings.</w:t>
+        <w:t>Sector-level increase in territorial material extraction under the central illustrative scenario, computed as the percentage difference between the agreement and baseline paths at 2034 (full implementation). Percentage effects are symmetric across blocs because the shock operates on shared temporal loadings. The values are conditional on the central shocks (Table 1) and scale with them (Table S7); they are illustrative, not estimated agreement effects.</w:t>
       </w:r>
     </w:p>
     <w:tbl>
@@ -4242,7 +4445,7 @@
                 <w:b/>
                 <w:sz w:val="20"/>
               </w:rPr>
-              <w:t>Projected increase (%)</w:t>
+              <w:t>Central-scenario increase (%)</w:t>
             </w:r>
           </w:p>
         </w:tc>
@@ -6001,7 +6204,7 @@
     </w:p>
     <w:p>
       <w:r>
-        <w:t>To illustrate the information gained by decomposing material extraction data with NTF rather than a standard two-dimensional method, the table below presents an LMDI (Log Mean Divisia Index) additive decomposition of the change in material extraction between 1990 and 2022, alongside the corresponding NTF component-level detail. The LMDI decomposes the total change into a scale effect (proportional growth of aggregate extraction) and a structure effect (shift in the composition across MFA categories), following the standard formulation in Ang (2015). NTF operates on the full four-dimensional tensor and identifies six latent extraction systems with country, sector, material, and temporal loadings.</w:t>
+        <w:t>To illustrate how NTF and a standard two-dimensional method provide complementary information, the table below presents an LMDI (Log Mean Divisia Index) additive decomposition of the change in material extraction between 1990 and 2022, alongside the corresponding NTF component-level detail. The LMDI decomposes the total change into a scale effect (proportional growth of aggregate extraction) and a structure effect (shift in the composition across MFA categories), following the standard formulation in Ang (2015). NTF operates on the full four-dimensional tensor and identifies six latent extraction systems with country, sector, material, and temporal loadings.</w:t>
       </w:r>
     </w:p>
     <w:p>
@@ -7460,7 +7663,7 @@
                 <w:b/>
                 <w:sz w:val="20"/>
               </w:rPr>
-              <w:t>LMDI (Ang 2015)</w:t>
+              <w:t>LMDI (Ang, 2015)</w:t>
             </w:r>
           </w:p>
         </w:tc>
@@ -7787,7 +7990,7 @@
               <w:rPr>
                 <w:sz w:val="20"/>
               </w:rPr>
-              <w:t>Lost by flattening</w:t>
+              <w:t>Aggregated by flattening</w:t>
             </w:r>
           </w:p>
         </w:tc>
@@ -8034,22 +8237,2358 @@
           <w:i/>
           <w:sz w:val="20"/>
         </w:rPr>
-        <w:t xml:space="preserve"> of the change is attributable to scale versus structural composition, but cannot identify </w:t>
+        <w:t xml:space="preserve"> of the change is attributable to scale versus structural composition, providing exact decomposition with zero residual. NTF identifies six interpretable extraction systems that simultaneously reveal country, sector, material, and temporal detail. The comparison demonstrates that NTF and LMDI answer complementary questions: LMDI for aggregate driver attribution, NTF for the identification of latent multi-dimensional extraction patterns</w:t>
+      </w:r>
+    </w:p>
+    <w:p>
+      <w:pPr>
+        <w:pStyle w:val="Heading2"/>
+      </w:pPr>
+      <w:r>
+        <w:t>Table S7. Sensitivity of the MFA-category effect to the assumed shocks</w:t>
+      </w:r>
+    </w:p>
+    <w:p>
+      <w:r>
+        <w:t xml:space="preserve">Scenario effect at 2034 (percentage difference between the agreement and baseline paths) for each MFA category, as the full shock vector δ is scaled and the phase-in window varied. The upper block scales δ at a fixed five-year phase-in; the </w:t>
       </w:r>
       <w:r>
         <w:rPr>
           <w:b w:val="0"/>
           <w:i/>
-          <w:sz w:val="20"/>
         </w:rPr>
-        <w:t>which sectors, countries, or material subcategories</w:t>
+        <w:t>Envelope</w:t>
       </w:r>
+      <w:r>
+        <w:t xml:space="preserve"> row reports the minimum and maximum across all 20 combinations of shock scale (0.5–1.5) and phase-in length (3–10 years). The final row applies equal shocks to every component to isolate the part of the cross-category pattern induced by the assumed concession ordering.</w:t>
+      </w:r>
+    </w:p>
+    <w:tbl>
+      <w:tblPr>
+        <w:tblStyle w:val="TableGrid"/>
+        <w:tblW w:type="auto" w:w="0"/>
+        <w:jc w:val="center"/>
+        <w:tblLook w:firstColumn="1" w:firstRow="1" w:lastColumn="0" w:lastRow="0" w:noHBand="0" w:noVBand="1" w:val="04A0"/>
+      </w:tblPr>
+      <w:tblGrid>
+        <w:gridCol w:w="1728"/>
+        <w:gridCol w:w="1728"/>
+        <w:gridCol w:w="1728"/>
+        <w:gridCol w:w="1728"/>
+        <w:gridCol w:w="1728"/>
+      </w:tblGrid>
+      <w:tr>
+        <w:tc>
+          <w:tcPr>
+            <w:tcW w:type="dxa" w:w="1728"/>
+          </w:tcPr>
+          <w:p>
+            <w:pPr>
+              <w:spacing w:after="40" w:line="240" w:lineRule="auto"/>
+            </w:pPr>
+            <w:r>
+              <w:rPr>
+                <w:b/>
+                <w:sz w:val="20"/>
+              </w:rPr>
+            </w:r>
+            <w:r>
+              <w:rPr>
+                <w:b/>
+                <w:sz w:val="20"/>
+              </w:rPr>
+              <w:t>Configuration</w:t>
+            </w:r>
+          </w:p>
+        </w:tc>
+        <w:tc>
+          <w:tcPr>
+            <w:tcW w:type="dxa" w:w="1728"/>
+          </w:tcPr>
+          <w:p>
+            <w:pPr>
+              <w:spacing w:after="40" w:line="240" w:lineRule="auto"/>
+            </w:pPr>
+            <w:r>
+              <w:rPr>
+                <w:b/>
+                <w:sz w:val="20"/>
+              </w:rPr>
+            </w:r>
+            <w:r>
+              <w:rPr>
+                <w:b/>
+                <w:sz w:val="20"/>
+              </w:rPr>
+              <w:t>Biomass (%)</w:t>
+            </w:r>
+          </w:p>
+        </w:tc>
+        <w:tc>
+          <w:tcPr>
+            <w:tcW w:type="dxa" w:w="1728"/>
+          </w:tcPr>
+          <w:p>
+            <w:pPr>
+              <w:spacing w:after="40" w:line="240" w:lineRule="auto"/>
+            </w:pPr>
+            <w:r>
+              <w:rPr>
+                <w:b/>
+                <w:sz w:val="20"/>
+              </w:rPr>
+            </w:r>
+            <w:r>
+              <w:rPr>
+                <w:b/>
+                <w:sz w:val="20"/>
+              </w:rPr>
+              <w:t>Metal ores (%)</w:t>
+            </w:r>
+          </w:p>
+        </w:tc>
+        <w:tc>
+          <w:tcPr>
+            <w:tcW w:type="dxa" w:w="1728"/>
+          </w:tcPr>
+          <w:p>
+            <w:pPr>
+              <w:spacing w:after="40" w:line="240" w:lineRule="auto"/>
+            </w:pPr>
+            <w:r>
+              <w:rPr>
+                <w:b/>
+                <w:sz w:val="20"/>
+              </w:rPr>
+            </w:r>
+            <w:r>
+              <w:rPr>
+                <w:b/>
+                <w:sz w:val="20"/>
+              </w:rPr>
+              <w:t>Non-metallic minerals (%)</w:t>
+            </w:r>
+          </w:p>
+        </w:tc>
+        <w:tc>
+          <w:tcPr>
+            <w:tcW w:type="dxa" w:w="1728"/>
+          </w:tcPr>
+          <w:p>
+            <w:pPr>
+              <w:spacing w:after="40" w:line="240" w:lineRule="auto"/>
+            </w:pPr>
+            <w:r>
+              <w:rPr>
+                <w:b/>
+                <w:sz w:val="20"/>
+              </w:rPr>
+            </w:r>
+            <w:r>
+              <w:rPr>
+                <w:b/>
+                <w:sz w:val="20"/>
+              </w:rPr>
+              <w:t>Ordering preserved</w:t>
+            </w:r>
+          </w:p>
+        </w:tc>
+      </w:tr>
+      <w:tr>
+        <w:tc>
+          <w:tcPr>
+            <w:tcW w:type="dxa" w:w="1728"/>
+          </w:tcPr>
+          <w:p>
+            <w:pPr>
+              <w:spacing w:after="40" w:line="240" w:lineRule="auto"/>
+            </w:pPr>
+            <w:r>
+              <w:rPr>
+                <w:sz w:val="20"/>
+              </w:rPr>
+            </w:r>
+            <w:r>
+              <w:rPr>
+                <w:sz w:val="20"/>
+              </w:rPr>
+              <w:t>Shock scale 0.50</w:t>
+            </w:r>
+          </w:p>
+        </w:tc>
+        <w:tc>
+          <w:tcPr>
+            <w:tcW w:type="dxa" w:w="1728"/>
+          </w:tcPr>
+          <w:p>
+            <w:pPr>
+              <w:spacing w:after="40" w:line="240" w:lineRule="auto"/>
+            </w:pPr>
+            <w:r>
+              <w:rPr>
+                <w:sz w:val="20"/>
+              </w:rPr>
+            </w:r>
+            <w:r>
+              <w:rPr>
+                <w:sz w:val="20"/>
+              </w:rPr>
+              <w:t>+4.2</w:t>
+            </w:r>
+          </w:p>
+        </w:tc>
+        <w:tc>
+          <w:tcPr>
+            <w:tcW w:type="dxa" w:w="1728"/>
+          </w:tcPr>
+          <w:p>
+            <w:pPr>
+              <w:spacing w:after="40" w:line="240" w:lineRule="auto"/>
+            </w:pPr>
+            <w:r>
+              <w:rPr>
+                <w:sz w:val="20"/>
+              </w:rPr>
+            </w:r>
+            <w:r>
+              <w:rPr>
+                <w:sz w:val="20"/>
+              </w:rPr>
+              <w:t>+2.9</w:t>
+            </w:r>
+          </w:p>
+        </w:tc>
+        <w:tc>
+          <w:tcPr>
+            <w:tcW w:type="dxa" w:w="1728"/>
+          </w:tcPr>
+          <w:p>
+            <w:pPr>
+              <w:spacing w:after="40" w:line="240" w:lineRule="auto"/>
+            </w:pPr>
+            <w:r>
+              <w:rPr>
+                <w:sz w:val="20"/>
+              </w:rPr>
+            </w:r>
+            <w:r>
+              <w:rPr>
+                <w:sz w:val="20"/>
+              </w:rPr>
+              <w:t>+1.0</w:t>
+            </w:r>
+          </w:p>
+        </w:tc>
+        <w:tc>
+          <w:tcPr>
+            <w:tcW w:type="dxa" w:w="1728"/>
+          </w:tcPr>
+          <w:p>
+            <w:pPr>
+              <w:spacing w:after="40" w:line="240" w:lineRule="auto"/>
+            </w:pPr>
+            <w:r>
+              <w:rPr>
+                <w:sz w:val="20"/>
+              </w:rPr>
+            </w:r>
+            <w:r>
+              <w:rPr>
+                <w:sz w:val="20"/>
+              </w:rPr>
+              <w:t>yes</w:t>
+            </w:r>
+          </w:p>
+        </w:tc>
+      </w:tr>
+      <w:tr>
+        <w:tc>
+          <w:tcPr>
+            <w:tcW w:type="dxa" w:w="1728"/>
+          </w:tcPr>
+          <w:p>
+            <w:pPr>
+              <w:spacing w:after="40" w:line="240" w:lineRule="auto"/>
+            </w:pPr>
+            <w:r>
+              <w:rPr>
+                <w:sz w:val="20"/>
+              </w:rPr>
+            </w:r>
+            <w:r>
+              <w:rPr>
+                <w:sz w:val="20"/>
+              </w:rPr>
+              <w:t>Shock scale 0.75</w:t>
+            </w:r>
+          </w:p>
+        </w:tc>
+        <w:tc>
+          <w:tcPr>
+            <w:tcW w:type="dxa" w:w="1728"/>
+          </w:tcPr>
+          <w:p>
+            <w:pPr>
+              <w:spacing w:after="40" w:line="240" w:lineRule="auto"/>
+            </w:pPr>
+            <w:r>
+              <w:rPr>
+                <w:sz w:val="20"/>
+              </w:rPr>
+            </w:r>
+            <w:r>
+              <w:rPr>
+                <w:sz w:val="20"/>
+              </w:rPr>
+              <w:t>+6.4</w:t>
+            </w:r>
+          </w:p>
+        </w:tc>
+        <w:tc>
+          <w:tcPr>
+            <w:tcW w:type="dxa" w:w="1728"/>
+          </w:tcPr>
+          <w:p>
+            <w:pPr>
+              <w:spacing w:after="40" w:line="240" w:lineRule="auto"/>
+            </w:pPr>
+            <w:r>
+              <w:rPr>
+                <w:sz w:val="20"/>
+              </w:rPr>
+            </w:r>
+            <w:r>
+              <w:rPr>
+                <w:sz w:val="20"/>
+              </w:rPr>
+              <w:t>+4.4</w:t>
+            </w:r>
+          </w:p>
+        </w:tc>
+        <w:tc>
+          <w:tcPr>
+            <w:tcW w:type="dxa" w:w="1728"/>
+          </w:tcPr>
+          <w:p>
+            <w:pPr>
+              <w:spacing w:after="40" w:line="240" w:lineRule="auto"/>
+            </w:pPr>
+            <w:r>
+              <w:rPr>
+                <w:sz w:val="20"/>
+              </w:rPr>
+            </w:r>
+            <w:r>
+              <w:rPr>
+                <w:sz w:val="20"/>
+              </w:rPr>
+              <w:t>+1.5</w:t>
+            </w:r>
+          </w:p>
+        </w:tc>
+        <w:tc>
+          <w:tcPr>
+            <w:tcW w:type="dxa" w:w="1728"/>
+          </w:tcPr>
+          <w:p>
+            <w:pPr>
+              <w:spacing w:after="40" w:line="240" w:lineRule="auto"/>
+            </w:pPr>
+            <w:r>
+              <w:rPr>
+                <w:sz w:val="20"/>
+              </w:rPr>
+            </w:r>
+            <w:r>
+              <w:rPr>
+                <w:sz w:val="20"/>
+              </w:rPr>
+              <w:t>yes</w:t>
+            </w:r>
+          </w:p>
+        </w:tc>
+      </w:tr>
+      <w:tr>
+        <w:tc>
+          <w:tcPr>
+            <w:tcW w:type="dxa" w:w="1728"/>
+          </w:tcPr>
+          <w:p>
+            <w:pPr>
+              <w:spacing w:after="40" w:line="240" w:lineRule="auto"/>
+            </w:pPr>
+            <w:r>
+              <w:rPr>
+                <w:sz w:val="20"/>
+              </w:rPr>
+            </w:r>
+            <w:r>
+              <w:rPr>
+                <w:sz w:val="20"/>
+              </w:rPr>
+              <w:t>Shock scale 1.00 (central)</w:t>
+            </w:r>
+          </w:p>
+        </w:tc>
+        <w:tc>
+          <w:tcPr>
+            <w:tcW w:type="dxa" w:w="1728"/>
+          </w:tcPr>
+          <w:p>
+            <w:pPr>
+              <w:spacing w:after="40" w:line="240" w:lineRule="auto"/>
+            </w:pPr>
+            <w:r>
+              <w:rPr>
+                <w:sz w:val="20"/>
+              </w:rPr>
+            </w:r>
+            <w:r>
+              <w:rPr>
+                <w:sz w:val="20"/>
+              </w:rPr>
+              <w:t>+8.5</w:t>
+            </w:r>
+          </w:p>
+        </w:tc>
+        <w:tc>
+          <w:tcPr>
+            <w:tcW w:type="dxa" w:w="1728"/>
+          </w:tcPr>
+          <w:p>
+            <w:pPr>
+              <w:spacing w:after="40" w:line="240" w:lineRule="auto"/>
+            </w:pPr>
+            <w:r>
+              <w:rPr>
+                <w:sz w:val="20"/>
+              </w:rPr>
+            </w:r>
+            <w:r>
+              <w:rPr>
+                <w:sz w:val="20"/>
+              </w:rPr>
+              <w:t>+5.8</w:t>
+            </w:r>
+          </w:p>
+        </w:tc>
+        <w:tc>
+          <w:tcPr>
+            <w:tcW w:type="dxa" w:w="1728"/>
+          </w:tcPr>
+          <w:p>
+            <w:pPr>
+              <w:spacing w:after="40" w:line="240" w:lineRule="auto"/>
+            </w:pPr>
+            <w:r>
+              <w:rPr>
+                <w:sz w:val="20"/>
+              </w:rPr>
+            </w:r>
+            <w:r>
+              <w:rPr>
+                <w:sz w:val="20"/>
+              </w:rPr>
+              <w:t>+2.0</w:t>
+            </w:r>
+          </w:p>
+        </w:tc>
+        <w:tc>
+          <w:tcPr>
+            <w:tcW w:type="dxa" w:w="1728"/>
+          </w:tcPr>
+          <w:p>
+            <w:pPr>
+              <w:spacing w:after="40" w:line="240" w:lineRule="auto"/>
+            </w:pPr>
+            <w:r>
+              <w:rPr>
+                <w:sz w:val="20"/>
+              </w:rPr>
+            </w:r>
+            <w:r>
+              <w:rPr>
+                <w:sz w:val="20"/>
+              </w:rPr>
+              <w:t>yes</w:t>
+            </w:r>
+          </w:p>
+        </w:tc>
+      </w:tr>
+      <w:tr>
+        <w:tc>
+          <w:tcPr>
+            <w:tcW w:type="dxa" w:w="1728"/>
+          </w:tcPr>
+          <w:p>
+            <w:pPr>
+              <w:spacing w:after="40" w:line="240" w:lineRule="auto"/>
+            </w:pPr>
+            <w:r>
+              <w:rPr>
+                <w:sz w:val="20"/>
+              </w:rPr>
+            </w:r>
+            <w:r>
+              <w:rPr>
+                <w:sz w:val="20"/>
+              </w:rPr>
+              <w:t>Shock scale 1.25</w:t>
+            </w:r>
+          </w:p>
+        </w:tc>
+        <w:tc>
+          <w:tcPr>
+            <w:tcW w:type="dxa" w:w="1728"/>
+          </w:tcPr>
+          <w:p>
+            <w:pPr>
+              <w:spacing w:after="40" w:line="240" w:lineRule="auto"/>
+            </w:pPr>
+            <w:r>
+              <w:rPr>
+                <w:sz w:val="20"/>
+              </w:rPr>
+            </w:r>
+            <w:r>
+              <w:rPr>
+                <w:sz w:val="20"/>
+              </w:rPr>
+              <w:t>+10.6</w:t>
+            </w:r>
+          </w:p>
+        </w:tc>
+        <w:tc>
+          <w:tcPr>
+            <w:tcW w:type="dxa" w:w="1728"/>
+          </w:tcPr>
+          <w:p>
+            <w:pPr>
+              <w:spacing w:after="40" w:line="240" w:lineRule="auto"/>
+            </w:pPr>
+            <w:r>
+              <w:rPr>
+                <w:sz w:val="20"/>
+              </w:rPr>
+            </w:r>
+            <w:r>
+              <w:rPr>
+                <w:sz w:val="20"/>
+              </w:rPr>
+              <w:t>+7.3</w:t>
+            </w:r>
+          </w:p>
+        </w:tc>
+        <w:tc>
+          <w:tcPr>
+            <w:tcW w:type="dxa" w:w="1728"/>
+          </w:tcPr>
+          <w:p>
+            <w:pPr>
+              <w:spacing w:after="40" w:line="240" w:lineRule="auto"/>
+            </w:pPr>
+            <w:r>
+              <w:rPr>
+                <w:sz w:val="20"/>
+              </w:rPr>
+            </w:r>
+            <w:r>
+              <w:rPr>
+                <w:sz w:val="20"/>
+              </w:rPr>
+              <w:t>+2.5</w:t>
+            </w:r>
+          </w:p>
+        </w:tc>
+        <w:tc>
+          <w:tcPr>
+            <w:tcW w:type="dxa" w:w="1728"/>
+          </w:tcPr>
+          <w:p>
+            <w:pPr>
+              <w:spacing w:after="40" w:line="240" w:lineRule="auto"/>
+            </w:pPr>
+            <w:r>
+              <w:rPr>
+                <w:sz w:val="20"/>
+              </w:rPr>
+            </w:r>
+            <w:r>
+              <w:rPr>
+                <w:sz w:val="20"/>
+              </w:rPr>
+              <w:t>yes</w:t>
+            </w:r>
+          </w:p>
+        </w:tc>
+      </w:tr>
+      <w:tr>
+        <w:tc>
+          <w:tcPr>
+            <w:tcW w:type="dxa" w:w="1728"/>
+          </w:tcPr>
+          <w:p>
+            <w:pPr>
+              <w:spacing w:after="40" w:line="240" w:lineRule="auto"/>
+            </w:pPr>
+            <w:r>
+              <w:rPr>
+                <w:sz w:val="20"/>
+              </w:rPr>
+            </w:r>
+            <w:r>
+              <w:rPr>
+                <w:sz w:val="20"/>
+              </w:rPr>
+              <w:t>Shock scale 1.50</w:t>
+            </w:r>
+          </w:p>
+        </w:tc>
+        <w:tc>
+          <w:tcPr>
+            <w:tcW w:type="dxa" w:w="1728"/>
+          </w:tcPr>
+          <w:p>
+            <w:pPr>
+              <w:spacing w:after="40" w:line="240" w:lineRule="auto"/>
+            </w:pPr>
+            <w:r>
+              <w:rPr>
+                <w:sz w:val="20"/>
+              </w:rPr>
+            </w:r>
+            <w:r>
+              <w:rPr>
+                <w:sz w:val="20"/>
+              </w:rPr>
+              <w:t>+12.7</w:t>
+            </w:r>
+          </w:p>
+        </w:tc>
+        <w:tc>
+          <w:tcPr>
+            <w:tcW w:type="dxa" w:w="1728"/>
+          </w:tcPr>
+          <w:p>
+            <w:pPr>
+              <w:spacing w:after="40" w:line="240" w:lineRule="auto"/>
+            </w:pPr>
+            <w:r>
+              <w:rPr>
+                <w:sz w:val="20"/>
+              </w:rPr>
+            </w:r>
+            <w:r>
+              <w:rPr>
+                <w:sz w:val="20"/>
+              </w:rPr>
+              <w:t>+8.8</w:t>
+            </w:r>
+          </w:p>
+        </w:tc>
+        <w:tc>
+          <w:tcPr>
+            <w:tcW w:type="dxa" w:w="1728"/>
+          </w:tcPr>
+          <w:p>
+            <w:pPr>
+              <w:spacing w:after="40" w:line="240" w:lineRule="auto"/>
+            </w:pPr>
+            <w:r>
+              <w:rPr>
+                <w:sz w:val="20"/>
+              </w:rPr>
+            </w:r>
+            <w:r>
+              <w:rPr>
+                <w:sz w:val="20"/>
+              </w:rPr>
+              <w:t>+3.0</w:t>
+            </w:r>
+          </w:p>
+        </w:tc>
+        <w:tc>
+          <w:tcPr>
+            <w:tcW w:type="dxa" w:w="1728"/>
+          </w:tcPr>
+          <w:p>
+            <w:pPr>
+              <w:spacing w:after="40" w:line="240" w:lineRule="auto"/>
+            </w:pPr>
+            <w:r>
+              <w:rPr>
+                <w:sz w:val="20"/>
+              </w:rPr>
+            </w:r>
+            <w:r>
+              <w:rPr>
+                <w:sz w:val="20"/>
+              </w:rPr>
+              <w:t>yes</w:t>
+            </w:r>
+          </w:p>
+        </w:tc>
+      </w:tr>
+      <w:tr>
+        <w:tc>
+          <w:tcPr>
+            <w:tcW w:type="dxa" w:w="1728"/>
+          </w:tcPr>
+          <w:p>
+            <w:pPr>
+              <w:spacing w:after="40" w:line="240" w:lineRule="auto"/>
+            </w:pPr>
+            <w:r>
+              <w:rPr>
+                <w:sz w:val="20"/>
+              </w:rPr>
+            </w:r>
+            <w:r>
+              <w:rPr>
+                <w:b/>
+                <w:i w:val="0"/>
+                <w:sz w:val="20"/>
+              </w:rPr>
+              <w:t>Envelope (scale 0.5–1.5 × phase-in 3–10 yr)</w:t>
+            </w:r>
+          </w:p>
+        </w:tc>
+        <w:tc>
+          <w:tcPr>
+            <w:tcW w:type="dxa" w:w="1728"/>
+          </w:tcPr>
+          <w:p>
+            <w:pPr>
+              <w:spacing w:after="40" w:line="240" w:lineRule="auto"/>
+            </w:pPr>
+            <w:r>
+              <w:rPr>
+                <w:sz w:val="20"/>
+              </w:rPr>
+            </w:r>
+            <w:r>
+              <w:rPr>
+                <w:b/>
+                <w:i w:val="0"/>
+                <w:sz w:val="20"/>
+              </w:rPr>
+              <w:t>+3.0 to +12.7</w:t>
+            </w:r>
+          </w:p>
+        </w:tc>
+        <w:tc>
+          <w:tcPr>
+            <w:tcW w:type="dxa" w:w="1728"/>
+          </w:tcPr>
+          <w:p>
+            <w:pPr>
+              <w:spacing w:after="40" w:line="240" w:lineRule="auto"/>
+            </w:pPr>
+            <w:r>
+              <w:rPr>
+                <w:sz w:val="20"/>
+              </w:rPr>
+            </w:r>
+            <w:r>
+              <w:rPr>
+                <w:b/>
+                <w:i w:val="0"/>
+                <w:sz w:val="20"/>
+              </w:rPr>
+              <w:t>+2.1 to +8.8</w:t>
+            </w:r>
+          </w:p>
+        </w:tc>
+        <w:tc>
+          <w:tcPr>
+            <w:tcW w:type="dxa" w:w="1728"/>
+          </w:tcPr>
+          <w:p>
+            <w:pPr>
+              <w:spacing w:after="40" w:line="240" w:lineRule="auto"/>
+            </w:pPr>
+            <w:r>
+              <w:rPr>
+                <w:sz w:val="20"/>
+              </w:rPr>
+            </w:r>
+            <w:r>
+              <w:rPr>
+                <w:b/>
+                <w:i w:val="0"/>
+                <w:sz w:val="20"/>
+              </w:rPr>
+              <w:t>+0.7 to +3.0</w:t>
+            </w:r>
+          </w:p>
+        </w:tc>
+        <w:tc>
+          <w:tcPr>
+            <w:tcW w:type="dxa" w:w="1728"/>
+          </w:tcPr>
+          <w:p>
+            <w:pPr>
+              <w:spacing w:after="40" w:line="240" w:lineRule="auto"/>
+            </w:pPr>
+            <w:r>
+              <w:rPr>
+                <w:sz w:val="20"/>
+              </w:rPr>
+            </w:r>
+            <w:r>
+              <w:rPr>
+                <w:b/>
+                <w:i w:val="0"/>
+                <w:sz w:val="20"/>
+              </w:rPr>
+              <w:t>20/20</w:t>
+            </w:r>
+          </w:p>
+        </w:tc>
+      </w:tr>
+      <w:tr>
+        <w:tc>
+          <w:tcPr>
+            <w:tcW w:type="dxa" w:w="1728"/>
+          </w:tcPr>
+          <w:p>
+            <w:pPr>
+              <w:spacing w:after="40" w:line="240" w:lineRule="auto"/>
+            </w:pPr>
+            <w:r>
+              <w:rPr>
+                <w:sz w:val="20"/>
+              </w:rPr>
+            </w:r>
+            <w:r>
+              <w:rPr>
+                <w:sz w:val="20"/>
+              </w:rPr>
+              <w:t>Equal shocks across components</w:t>
+            </w:r>
+          </w:p>
+        </w:tc>
+        <w:tc>
+          <w:tcPr>
+            <w:tcW w:type="dxa" w:w="1728"/>
+          </w:tcPr>
+          <w:p>
+            <w:pPr>
+              <w:spacing w:after="40" w:line="240" w:lineRule="auto"/>
+            </w:pPr>
+            <w:r>
+              <w:rPr>
+                <w:sz w:val="20"/>
+              </w:rPr>
+            </w:r>
+            <w:r>
+              <w:rPr>
+                <w:sz w:val="20"/>
+              </w:rPr>
+              <w:t>+5.5</w:t>
+            </w:r>
+          </w:p>
+        </w:tc>
+        <w:tc>
+          <w:tcPr>
+            <w:tcW w:type="dxa" w:w="1728"/>
+          </w:tcPr>
+          <w:p>
+            <w:pPr>
+              <w:spacing w:after="40" w:line="240" w:lineRule="auto"/>
+            </w:pPr>
+            <w:r>
+              <w:rPr>
+                <w:sz w:val="20"/>
+              </w:rPr>
+            </w:r>
+            <w:r>
+              <w:rPr>
+                <w:sz w:val="20"/>
+              </w:rPr>
+              <w:t>+5.5</w:t>
+            </w:r>
+          </w:p>
+        </w:tc>
+        <w:tc>
+          <w:tcPr>
+            <w:tcW w:type="dxa" w:w="1728"/>
+          </w:tcPr>
+          <w:p>
+            <w:pPr>
+              <w:spacing w:after="40" w:line="240" w:lineRule="auto"/>
+            </w:pPr>
+            <w:r>
+              <w:rPr>
+                <w:sz w:val="20"/>
+              </w:rPr>
+            </w:r>
+            <w:r>
+              <w:rPr>
+                <w:sz w:val="20"/>
+              </w:rPr>
+              <w:t>+5.4</w:t>
+            </w:r>
+          </w:p>
+        </w:tc>
+        <w:tc>
+          <w:tcPr>
+            <w:tcW w:type="dxa" w:w="1728"/>
+          </w:tcPr>
+          <w:p>
+            <w:pPr>
+              <w:spacing w:after="40" w:line="240" w:lineRule="auto"/>
+            </w:pPr>
+            <w:r>
+              <w:rPr>
+                <w:sz w:val="20"/>
+              </w:rPr>
+            </w:r>
+            <w:r>
+              <w:rPr>
+                <w:sz w:val="20"/>
+              </w:rPr>
+              <w:t>n.a.</w:t>
+            </w:r>
+          </w:p>
+        </w:tc>
+      </w:tr>
+    </w:tbl>
+    <w:p>
+      <w:pPr>
+        <w:spacing w:before="120" w:after="240"/>
+        <w:jc w:val="both"/>
+      </w:pPr>
       <w:r>
         <w:rPr>
           <w:i/>
           <w:sz w:val="20"/>
         </w:rPr>
-        <w:t xml:space="preserve"> drive the change within each MFA category. NTF identifies six interpretable extraction systems that simultaneously reveal country, sector, material, and temporal detail — information that is lost when multi-dimensional data are flattened into two-way matrices. The comparison demonstrates that NTF and LMDI answer complementary questions: LMDI for aggregate driver attribution, NTF for the identification of latent multi-dimensional extraction patterns.</w:t>
+        <w:t>Note: The magnitudes scale approximately linearly with the assumed shock, confirming that they are conditional outputs of the scenario rather than empirical estimates. The ordering biomass &gt; metal ores &gt; non-metallic minerals holds in all 20 combinations of the central calibration; under equal shocks the cross-category differentiation collapses, demonstrating that the spread between categories is driven by the assumed concession ordering — itself grounded in the published tariff schedules (Table 1) — and not by the data. The phase-in length affects the magnitudes only when it extends beyond the 2032 saturation point; effects are identical for phase-in windows of 3–7 years and attenuate for longer windows.</w:t>
+      </w:r>
+    </w:p>
+    <w:p>
+      <w:pPr>
+        <w:pStyle w:val="Heading2"/>
+      </w:pPr>
+      <w:r>
+        <w:t>Table S8. NTF components versus a naive table of MFA subcategory totals</w:t>
+      </w:r>
+    </w:p>
+    <w:p>
+      <w:r>
+        <w:t>For each of the 15 material subcategories, the table reports the NTF component on which it loads most strongly and the additional country, sector, and temporal structure that the decomposition attaches — information that a static table of subcategory tonnage totals cannot convey. This addresses whether the near-diagonal material heatmap (Fig. 3) merely reproduces the input classification.</w:t>
+      </w:r>
+    </w:p>
+    <w:tbl>
+      <w:tblPr>
+        <w:tblStyle w:val="TableGrid"/>
+        <w:tblW w:type="auto" w:w="0"/>
+        <w:jc w:val="center"/>
+        <w:tblLook w:firstColumn="1" w:firstRow="1" w:lastColumn="0" w:lastRow="0" w:noHBand="0" w:noVBand="1" w:val="04A0"/>
+      </w:tblPr>
+      <w:tblGrid>
+        <w:gridCol w:w="2160"/>
+        <w:gridCol w:w="2160"/>
+        <w:gridCol w:w="2160"/>
+        <w:gridCol w:w="2160"/>
+      </w:tblGrid>
+      <w:tr>
+        <w:tc>
+          <w:tcPr>
+            <w:tcW w:type="dxa" w:w="2160"/>
+          </w:tcPr>
+          <w:p>
+            <w:pPr>
+              <w:spacing w:after="40" w:line="240" w:lineRule="auto"/>
+            </w:pPr>
+            <w:r>
+              <w:rPr>
+                <w:b/>
+                <w:sz w:val="20"/>
+              </w:rPr>
+            </w:r>
+            <w:r>
+              <w:rPr>
+                <w:b/>
+                <w:sz w:val="20"/>
+              </w:rPr>
+              <w:t>Subcategory</w:t>
+            </w:r>
+          </w:p>
+        </w:tc>
+        <w:tc>
+          <w:tcPr>
+            <w:tcW w:type="dxa" w:w="2160"/>
+          </w:tcPr>
+          <w:p>
+            <w:pPr>
+              <w:spacing w:after="40" w:line="240" w:lineRule="auto"/>
+            </w:pPr>
+            <w:r>
+              <w:rPr>
+                <w:b/>
+                <w:sz w:val="20"/>
+              </w:rPr>
+            </w:r>
+            <w:r>
+              <w:rPr>
+                <w:b/>
+                <w:sz w:val="20"/>
+              </w:rPr>
+              <w:t>Peak component (loading)</w:t>
+            </w:r>
+          </w:p>
+        </w:tc>
+        <w:tc>
+          <w:tcPr>
+            <w:tcW w:type="dxa" w:w="2160"/>
+          </w:tcPr>
+          <w:p>
+            <w:pPr>
+              <w:spacing w:after="40" w:line="240" w:lineRule="auto"/>
+            </w:pPr>
+            <w:r>
+              <w:rPr>
+                <w:b/>
+                <w:sz w:val="20"/>
+              </w:rPr>
+            </w:r>
+            <w:r>
+              <w:rPr>
+                <w:b/>
+                <w:sz w:val="20"/>
+              </w:rPr>
+              <w:t>Secondary loading</w:t>
+            </w:r>
+          </w:p>
+        </w:tc>
+        <w:tc>
+          <w:tcPr>
+            <w:tcW w:type="dxa" w:w="2160"/>
+          </w:tcPr>
+          <w:p>
+            <w:pPr>
+              <w:spacing w:after="40" w:line="240" w:lineRule="auto"/>
+            </w:pPr>
+            <w:r>
+              <w:rPr>
+                <w:b/>
+                <w:sz w:val="20"/>
+              </w:rPr>
+            </w:r>
+            <w:r>
+              <w:rPr>
+                <w:b/>
+                <w:sz w:val="20"/>
+              </w:rPr>
+              <w:t>Structure NTF adds beyond a subcategory total</w:t>
+            </w:r>
+          </w:p>
+        </w:tc>
+      </w:tr>
+      <w:tr>
+        <w:tc>
+          <w:tcPr>
+            <w:tcW w:type="dxa" w:w="2160"/>
+          </w:tcPr>
+          <w:p>
+            <w:pPr>
+              <w:spacing w:after="40" w:line="240" w:lineRule="auto"/>
+            </w:pPr>
+            <w:r>
+              <w:rPr>
+                <w:sz w:val="20"/>
+              </w:rPr>
+            </w:r>
+            <w:r>
+              <w:rPr>
+                <w:sz w:val="20"/>
+              </w:rPr>
+              <w:t>Crops</w:t>
+            </w:r>
+          </w:p>
+        </w:tc>
+        <w:tc>
+          <w:tcPr>
+            <w:tcW w:type="dxa" w:w="2160"/>
+          </w:tcPr>
+          <w:p>
+            <w:pPr>
+              <w:spacing w:after="40" w:line="240" w:lineRule="auto"/>
+            </w:pPr>
+            <w:r>
+              <w:rPr>
+                <w:sz w:val="20"/>
+              </w:rPr>
+            </w:r>
+            <w:r>
+              <w:rPr>
+                <w:sz w:val="20"/>
+              </w:rPr>
+              <w:t>C1 (0.998)</w:t>
+            </w:r>
+          </w:p>
+        </w:tc>
+        <w:tc>
+          <w:tcPr>
+            <w:tcW w:type="dxa" w:w="2160"/>
+          </w:tcPr>
+          <w:p>
+            <w:pPr>
+              <w:spacing w:after="40" w:line="240" w:lineRule="auto"/>
+            </w:pPr>
+            <w:r>
+              <w:rPr>
+                <w:sz w:val="20"/>
+              </w:rPr>
+            </w:r>
+            <w:r>
+              <w:rPr>
+                <w:sz w:val="20"/>
+              </w:rPr>
+              <w:t>—</w:t>
+            </w:r>
+          </w:p>
+        </w:tc>
+        <w:tc>
+          <w:tcPr>
+            <w:tcW w:type="dxa" w:w="2160"/>
+          </w:tcPr>
+          <w:p>
+            <w:pPr>
+              <w:spacing w:after="40" w:line="240" w:lineRule="auto"/>
+            </w:pPr>
+            <w:r>
+              <w:rPr>
+                <w:sz w:val="20"/>
+              </w:rPr>
+            </w:r>
+            <w:r>
+              <w:rPr>
+                <w:sz w:val="20"/>
+              </w:rPr>
+              <w:t>Country spread (BRA, FRA, ARG); +0.31/yr trend</w:t>
+            </w:r>
+          </w:p>
+        </w:tc>
+      </w:tr>
+      <w:tr>
+        <w:tc>
+          <w:tcPr>
+            <w:tcW w:type="dxa" w:w="2160"/>
+          </w:tcPr>
+          <w:p>
+            <w:pPr>
+              <w:spacing w:after="40" w:line="240" w:lineRule="auto"/>
+            </w:pPr>
+            <w:r>
+              <w:rPr>
+                <w:sz w:val="20"/>
+              </w:rPr>
+            </w:r>
+            <w:r>
+              <w:rPr>
+                <w:sz w:val="20"/>
+              </w:rPr>
+              <w:t>Crop residues</w:t>
+            </w:r>
+          </w:p>
+        </w:tc>
+        <w:tc>
+          <w:tcPr>
+            <w:tcW w:type="dxa" w:w="2160"/>
+          </w:tcPr>
+          <w:p>
+            <w:pPr>
+              <w:spacing w:after="40" w:line="240" w:lineRule="auto"/>
+            </w:pPr>
+            <w:r>
+              <w:rPr>
+                <w:sz w:val="20"/>
+              </w:rPr>
+            </w:r>
+            <w:r>
+              <w:rPr>
+                <w:sz w:val="20"/>
+              </w:rPr>
+              <w:t>C5 (0.711)</w:t>
+            </w:r>
+          </w:p>
+        </w:tc>
+        <w:tc>
+          <w:tcPr>
+            <w:tcW w:type="dxa" w:w="2160"/>
+          </w:tcPr>
+          <w:p>
+            <w:pPr>
+              <w:spacing w:after="40" w:line="240" w:lineRule="auto"/>
+            </w:pPr>
+            <w:r>
+              <w:rPr>
+                <w:sz w:val="20"/>
+              </w:rPr>
+            </w:r>
+            <w:r>
+              <w:rPr>
+                <w:sz w:val="20"/>
+              </w:rPr>
+              <w:t>C1 (0.066)</w:t>
+            </w:r>
+          </w:p>
+        </w:tc>
+        <w:tc>
+          <w:tcPr>
+            <w:tcW w:type="dxa" w:w="2160"/>
+          </w:tcPr>
+          <w:p>
+            <w:pPr>
+              <w:spacing w:after="40" w:line="240" w:lineRule="auto"/>
+            </w:pPr>
+            <w:r>
+              <w:rPr>
+                <w:sz w:val="20"/>
+              </w:rPr>
+            </w:r>
+            <w:r>
+              <w:rPr>
+                <w:sz w:val="20"/>
+              </w:rPr>
+              <w:t>Coupled with grazed biomass and livestock sectors</w:t>
+            </w:r>
+          </w:p>
+        </w:tc>
+      </w:tr>
+      <w:tr>
+        <w:tc>
+          <w:tcPr>
+            <w:tcW w:type="dxa" w:w="2160"/>
+          </w:tcPr>
+          <w:p>
+            <w:pPr>
+              <w:spacing w:after="40" w:line="240" w:lineRule="auto"/>
+            </w:pPr>
+            <w:r>
+              <w:rPr>
+                <w:sz w:val="20"/>
+              </w:rPr>
+            </w:r>
+            <w:r>
+              <w:rPr>
+                <w:sz w:val="20"/>
+              </w:rPr>
+              <w:t>Grazed biomass</w:t>
+            </w:r>
+          </w:p>
+        </w:tc>
+        <w:tc>
+          <w:tcPr>
+            <w:tcW w:type="dxa" w:w="2160"/>
+          </w:tcPr>
+          <w:p>
+            <w:pPr>
+              <w:spacing w:after="40" w:line="240" w:lineRule="auto"/>
+            </w:pPr>
+            <w:r>
+              <w:rPr>
+                <w:sz w:val="20"/>
+              </w:rPr>
+            </w:r>
+            <w:r>
+              <w:rPr>
+                <w:sz w:val="20"/>
+              </w:rPr>
+              <w:t>C5 (0.704)</w:t>
+            </w:r>
+          </w:p>
+        </w:tc>
+        <w:tc>
+          <w:tcPr>
+            <w:tcW w:type="dxa" w:w="2160"/>
+          </w:tcPr>
+          <w:p>
+            <w:pPr>
+              <w:spacing w:after="40" w:line="240" w:lineRule="auto"/>
+            </w:pPr>
+            <w:r>
+              <w:rPr>
+                <w:sz w:val="20"/>
+              </w:rPr>
+            </w:r>
+            <w:r>
+              <w:rPr>
+                <w:sz w:val="20"/>
+              </w:rPr>
+              <w:t>C3 (0.035)</w:t>
+            </w:r>
+          </w:p>
+        </w:tc>
+        <w:tc>
+          <w:tcPr>
+            <w:tcW w:type="dxa" w:w="2160"/>
+          </w:tcPr>
+          <w:p>
+            <w:pPr>
+              <w:spacing w:after="40" w:line="240" w:lineRule="auto"/>
+            </w:pPr>
+            <w:r>
+              <w:rPr>
+                <w:sz w:val="20"/>
+              </w:rPr>
+            </w:r>
+            <w:r>
+              <w:rPr>
+                <w:sz w:val="20"/>
+              </w:rPr>
+              <w:t>Coupled with crop residues and cattle/sheep sectors</w:t>
+            </w:r>
+          </w:p>
+        </w:tc>
+      </w:tr>
+      <w:tr>
+        <w:tc>
+          <w:tcPr>
+            <w:tcW w:type="dxa" w:w="2160"/>
+          </w:tcPr>
+          <w:p>
+            <w:pPr>
+              <w:spacing w:after="40" w:line="240" w:lineRule="auto"/>
+            </w:pPr>
+            <w:r>
+              <w:rPr>
+                <w:sz w:val="20"/>
+              </w:rPr>
+            </w:r>
+            <w:r>
+              <w:rPr>
+                <w:sz w:val="20"/>
+              </w:rPr>
+              <w:t>Wood</w:t>
+            </w:r>
+          </w:p>
+        </w:tc>
+        <w:tc>
+          <w:tcPr>
+            <w:tcW w:type="dxa" w:w="2160"/>
+          </w:tcPr>
+          <w:p>
+            <w:pPr>
+              <w:spacing w:after="40" w:line="240" w:lineRule="auto"/>
+            </w:pPr>
+            <w:r>
+              <w:rPr>
+                <w:sz w:val="20"/>
+              </w:rPr>
+            </w:r>
+            <w:r>
+              <w:rPr>
+                <w:sz w:val="20"/>
+              </w:rPr>
+              <w:t>C2 (1.000)</w:t>
+            </w:r>
+          </w:p>
+        </w:tc>
+        <w:tc>
+          <w:tcPr>
+            <w:tcW w:type="dxa" w:w="2160"/>
+          </w:tcPr>
+          <w:p>
+            <w:pPr>
+              <w:spacing w:after="40" w:line="240" w:lineRule="auto"/>
+            </w:pPr>
+            <w:r>
+              <w:rPr>
+                <w:sz w:val="20"/>
+              </w:rPr>
+            </w:r>
+            <w:r>
+              <w:rPr>
+                <w:sz w:val="20"/>
+              </w:rPr>
+              <w:t>—</w:t>
+            </w:r>
+          </w:p>
+        </w:tc>
+        <w:tc>
+          <w:tcPr>
+            <w:tcW w:type="dxa" w:w="2160"/>
+          </w:tcPr>
+          <w:p>
+            <w:pPr>
+              <w:spacing w:after="40" w:line="240" w:lineRule="auto"/>
+            </w:pPr>
+            <w:r>
+              <w:rPr>
+                <w:sz w:val="20"/>
+              </w:rPr>
+            </w:r>
+            <w:r>
+              <w:rPr>
+                <w:sz w:val="20"/>
+              </w:rPr>
+              <w:t>Forestry + sawmill sectors; BRA/SWE/DEU</w:t>
+            </w:r>
+          </w:p>
+        </w:tc>
+      </w:tr>
+      <w:tr>
+        <w:tc>
+          <w:tcPr>
+            <w:tcW w:type="dxa" w:w="2160"/>
+          </w:tcPr>
+          <w:p>
+            <w:pPr>
+              <w:spacing w:after="40" w:line="240" w:lineRule="auto"/>
+            </w:pPr>
+            <w:r>
+              <w:rPr>
+                <w:sz w:val="20"/>
+              </w:rPr>
+            </w:r>
+            <w:r>
+              <w:rPr>
+                <w:sz w:val="20"/>
+              </w:rPr>
+              <w:t>Fishery and aquatic</w:t>
+            </w:r>
+          </w:p>
+        </w:tc>
+        <w:tc>
+          <w:tcPr>
+            <w:tcW w:type="dxa" w:w="2160"/>
+          </w:tcPr>
+          <w:p>
+            <w:pPr>
+              <w:spacing w:after="40" w:line="240" w:lineRule="auto"/>
+            </w:pPr>
+            <w:r>
+              <w:rPr>
+                <w:sz w:val="20"/>
+              </w:rPr>
+            </w:r>
+            <w:r>
+              <w:rPr>
+                <w:sz w:val="20"/>
+              </w:rPr>
+              <w:t>C3 (0.999)</w:t>
+            </w:r>
+          </w:p>
+        </w:tc>
+        <w:tc>
+          <w:tcPr>
+            <w:tcW w:type="dxa" w:w="2160"/>
+          </w:tcPr>
+          <w:p>
+            <w:pPr>
+              <w:spacing w:after="40" w:line="240" w:lineRule="auto"/>
+            </w:pPr>
+            <w:r>
+              <w:rPr>
+                <w:sz w:val="20"/>
+              </w:rPr>
+            </w:r>
+            <w:r>
+              <w:rPr>
+                <w:sz w:val="20"/>
+              </w:rPr>
+              <w:t>—</w:t>
+            </w:r>
+          </w:p>
+        </w:tc>
+        <w:tc>
+          <w:tcPr>
+            <w:tcW w:type="dxa" w:w="2160"/>
+          </w:tcPr>
+          <w:p>
+            <w:pPr>
+              <w:spacing w:after="40" w:line="240" w:lineRule="auto"/>
+            </w:pPr>
+            <w:r>
+              <w:rPr>
+                <w:sz w:val="20"/>
+              </w:rPr>
+            </w:r>
+            <w:r>
+              <w:rPr>
+                <w:sz w:val="20"/>
+              </w:rPr>
+              <w:t>Fishing/crustacean sectors; ARG/DNK; flat trend</w:t>
+            </w:r>
+          </w:p>
+        </w:tc>
+      </w:tr>
+      <w:tr>
+        <w:tc>
+          <w:tcPr>
+            <w:tcW w:type="dxa" w:w="2160"/>
+          </w:tcPr>
+          <w:p>
+            <w:pPr>
+              <w:spacing w:after="40" w:line="240" w:lineRule="auto"/>
+            </w:pPr>
+            <w:r>
+              <w:rPr>
+                <w:sz w:val="20"/>
+              </w:rPr>
+            </w:r>
+            <w:r>
+              <w:rPr>
+                <w:sz w:val="20"/>
+              </w:rPr>
+              <w:t>Other metals</w:t>
+            </w:r>
+          </w:p>
+        </w:tc>
+        <w:tc>
+          <w:tcPr>
+            <w:tcW w:type="dxa" w:w="2160"/>
+          </w:tcPr>
+          <w:p>
+            <w:pPr>
+              <w:spacing w:after="40" w:line="240" w:lineRule="auto"/>
+            </w:pPr>
+            <w:r>
+              <w:rPr>
+                <w:sz w:val="20"/>
+              </w:rPr>
+            </w:r>
+            <w:r>
+              <w:rPr>
+                <w:sz w:val="20"/>
+              </w:rPr>
+              <w:t>C6 (1.000)</w:t>
+            </w:r>
+          </w:p>
+        </w:tc>
+        <w:tc>
+          <w:tcPr>
+            <w:tcW w:type="dxa" w:w="2160"/>
+          </w:tcPr>
+          <w:p>
+            <w:pPr>
+              <w:spacing w:after="40" w:line="240" w:lineRule="auto"/>
+            </w:pPr>
+            <w:r>
+              <w:rPr>
+                <w:sz w:val="20"/>
+              </w:rPr>
+            </w:r>
+            <w:r>
+              <w:rPr>
+                <w:sz w:val="20"/>
+              </w:rPr>
+              <w:t>—</w:t>
+            </w:r>
+          </w:p>
+        </w:tc>
+        <w:tc>
+          <w:tcPr>
+            <w:tcW w:type="dxa" w:w="2160"/>
+          </w:tcPr>
+          <w:p>
+            <w:pPr>
+              <w:spacing w:after="40" w:line="240" w:lineRule="auto"/>
+            </w:pPr>
+            <w:r>
+              <w:rPr>
+                <w:sz w:val="20"/>
+              </w:rPr>
+            </w:r>
+            <w:r>
+              <w:rPr>
+                <w:sz w:val="20"/>
+              </w:rPr>
+              <w:t>Brazil-dominated (0.42); declining trend (−0.03/yr)</w:t>
+            </w:r>
+          </w:p>
+        </w:tc>
+      </w:tr>
+      <w:tr>
+        <w:tc>
+          <w:tcPr>
+            <w:tcW w:type="dxa" w:w="2160"/>
+          </w:tcPr>
+          <w:p>
+            <w:pPr>
+              <w:spacing w:after="40" w:line="240" w:lineRule="auto"/>
+            </w:pPr>
+            <w:r>
+              <w:rPr>
+                <w:sz w:val="20"/>
+              </w:rPr>
+            </w:r>
+            <w:r>
+              <w:rPr>
+                <w:sz w:val="20"/>
+              </w:rPr>
+              <w:t>Construction minerals</w:t>
+            </w:r>
+          </w:p>
+        </w:tc>
+        <w:tc>
+          <w:tcPr>
+            <w:tcW w:type="dxa" w:w="2160"/>
+          </w:tcPr>
+          <w:p>
+            <w:pPr>
+              <w:spacing w:after="40" w:line="240" w:lineRule="auto"/>
+            </w:pPr>
+            <w:r>
+              <w:rPr>
+                <w:sz w:val="20"/>
+              </w:rPr>
+            </w:r>
+            <w:r>
+              <w:rPr>
+                <w:sz w:val="20"/>
+              </w:rPr>
+              <w:t>C4 (0.528)</w:t>
+            </w:r>
+          </w:p>
+        </w:tc>
+        <w:tc>
+          <w:tcPr>
+            <w:tcW w:type="dxa" w:w="2160"/>
+          </w:tcPr>
+          <w:p>
+            <w:pPr>
+              <w:spacing w:after="40" w:line="240" w:lineRule="auto"/>
+            </w:pPr>
+            <w:r>
+              <w:rPr>
+                <w:sz w:val="20"/>
+              </w:rPr>
+            </w:r>
+            <w:r>
+              <w:rPr>
+                <w:sz w:val="20"/>
+              </w:rPr>
+              <w:t>—</w:t>
+            </w:r>
+          </w:p>
+        </w:tc>
+        <w:tc>
+          <w:tcPr>
+            <w:tcW w:type="dxa" w:w="2160"/>
+          </w:tcPr>
+          <w:p>
+            <w:pPr>
+              <w:spacing w:after="40" w:line="240" w:lineRule="auto"/>
+            </w:pPr>
+            <w:r>
+              <w:rPr>
+                <w:sz w:val="20"/>
+              </w:rPr>
+            </w:r>
+            <w:r>
+              <w:rPr>
+                <w:sz w:val="20"/>
+              </w:rPr>
+              <w:t>Quarrying sector; ESP/DEU</w:t>
+            </w:r>
+          </w:p>
+        </w:tc>
+      </w:tr>
+      <w:tr>
+        <w:tc>
+          <w:tcPr>
+            <w:tcW w:type="dxa" w:w="2160"/>
+          </w:tcPr>
+          <w:p>
+            <w:pPr>
+              <w:spacing w:after="40" w:line="240" w:lineRule="auto"/>
+            </w:pPr>
+            <w:r>
+              <w:rPr>
+                <w:sz w:val="20"/>
+              </w:rPr>
+            </w:r>
+            <w:r>
+              <w:rPr>
+                <w:sz w:val="20"/>
+              </w:rPr>
+              <w:t>Industrial minerals</w:t>
+            </w:r>
+          </w:p>
+        </w:tc>
+        <w:tc>
+          <w:tcPr>
+            <w:tcW w:type="dxa" w:w="2160"/>
+          </w:tcPr>
+          <w:p>
+            <w:pPr>
+              <w:spacing w:after="40" w:line="240" w:lineRule="auto"/>
+            </w:pPr>
+            <w:r>
+              <w:rPr>
+                <w:sz w:val="20"/>
+              </w:rPr>
+            </w:r>
+            <w:r>
+              <w:rPr>
+                <w:sz w:val="20"/>
+              </w:rPr>
+              <w:t>C4 (0.849)</w:t>
+            </w:r>
+          </w:p>
+        </w:tc>
+        <w:tc>
+          <w:tcPr>
+            <w:tcW w:type="dxa" w:w="2160"/>
+          </w:tcPr>
+          <w:p>
+            <w:pPr>
+              <w:spacing w:after="40" w:line="240" w:lineRule="auto"/>
+            </w:pPr>
+            <w:r>
+              <w:rPr>
+                <w:sz w:val="20"/>
+              </w:rPr>
+            </w:r>
+            <w:r>
+              <w:rPr>
+                <w:sz w:val="20"/>
+              </w:rPr>
+              <w:t>—</w:t>
+            </w:r>
+          </w:p>
+        </w:tc>
+        <w:tc>
+          <w:tcPr>
+            <w:tcW w:type="dxa" w:w="2160"/>
+          </w:tcPr>
+          <w:p>
+            <w:pPr>
+              <w:spacing w:after="40" w:line="240" w:lineRule="auto"/>
+            </w:pPr>
+            <w:r>
+              <w:rPr>
+                <w:sz w:val="20"/>
+              </w:rPr>
+            </w:r>
+            <w:r>
+              <w:rPr>
+                <w:sz w:val="20"/>
+              </w:rPr>
+              <w:t>Shares C4 with construction minerals</w:t>
+            </w:r>
+          </w:p>
+        </w:tc>
+      </w:tr>
+      <w:tr>
+        <w:tc>
+          <w:tcPr>
+            <w:tcW w:type="dxa" w:w="2160"/>
+          </w:tcPr>
+          <w:p>
+            <w:pPr>
+              <w:spacing w:after="40" w:line="240" w:lineRule="auto"/>
+            </w:pPr>
+            <w:r>
+              <w:rPr>
+                <w:sz w:val="20"/>
+              </w:rPr>
+            </w:r>
+            <w:r>
+              <w:rPr>
+                <w:sz w:val="20"/>
+              </w:rPr>
+              <w:t>Iron</w:t>
+            </w:r>
+          </w:p>
+        </w:tc>
+        <w:tc>
+          <w:tcPr>
+            <w:tcW w:type="dxa" w:w="2160"/>
+          </w:tcPr>
+          <w:p>
+            <w:pPr>
+              <w:spacing w:after="40" w:line="240" w:lineRule="auto"/>
+            </w:pPr>
+            <w:r>
+              <w:rPr>
+                <w:sz w:val="20"/>
+              </w:rPr>
+            </w:r>
+            <w:r>
+              <w:rPr>
+                <w:sz w:val="20"/>
+              </w:rPr>
+              <w:t>— (&lt;10⁻³)</w:t>
+            </w:r>
+          </w:p>
+        </w:tc>
+        <w:tc>
+          <w:tcPr>
+            <w:tcW w:type="dxa" w:w="2160"/>
+          </w:tcPr>
+          <w:p>
+            <w:pPr>
+              <w:spacing w:after="40" w:line="240" w:lineRule="auto"/>
+            </w:pPr>
+            <w:r>
+              <w:rPr>
+                <w:sz w:val="20"/>
+              </w:rPr>
+            </w:r>
+            <w:r>
+              <w:rPr>
+                <w:sz w:val="20"/>
+              </w:rPr>
+              <w:t>—</w:t>
+            </w:r>
+          </w:p>
+        </w:tc>
+        <w:tc>
+          <w:tcPr>
+            <w:tcW w:type="dxa" w:w="2160"/>
+          </w:tcPr>
+          <w:p>
+            <w:pPr>
+              <w:spacing w:after="40" w:line="240" w:lineRule="auto"/>
+            </w:pPr>
+            <w:r>
+              <w:rPr>
+                <w:sz w:val="20"/>
+              </w:rPr>
+            </w:r>
+            <w:r>
+              <w:rPr>
+                <w:sz w:val="20"/>
+              </w:rPr>
+              <w:t>Not represented (localised; see Section 5.4)</w:t>
+            </w:r>
+          </w:p>
+        </w:tc>
+      </w:tr>
+      <w:tr>
+        <w:tc>
+          <w:tcPr>
+            <w:tcW w:type="dxa" w:w="2160"/>
+          </w:tcPr>
+          <w:p>
+            <w:pPr>
+              <w:spacing w:after="40" w:line="240" w:lineRule="auto"/>
+            </w:pPr>
+            <w:r>
+              <w:rPr>
+                <w:sz w:val="20"/>
+              </w:rPr>
+            </w:r>
+            <w:r>
+              <w:rPr>
+                <w:sz w:val="20"/>
+              </w:rPr>
+              <w:t>Aluminium</w:t>
+            </w:r>
+          </w:p>
+        </w:tc>
+        <w:tc>
+          <w:tcPr>
+            <w:tcW w:type="dxa" w:w="2160"/>
+          </w:tcPr>
+          <w:p>
+            <w:pPr>
+              <w:spacing w:after="40" w:line="240" w:lineRule="auto"/>
+            </w:pPr>
+            <w:r>
+              <w:rPr>
+                <w:sz w:val="20"/>
+              </w:rPr>
+            </w:r>
+            <w:r>
+              <w:rPr>
+                <w:sz w:val="20"/>
+              </w:rPr>
+              <w:t>— (&lt;10⁻³)</w:t>
+            </w:r>
+          </w:p>
+        </w:tc>
+        <w:tc>
+          <w:tcPr>
+            <w:tcW w:type="dxa" w:w="2160"/>
+          </w:tcPr>
+          <w:p>
+            <w:pPr>
+              <w:spacing w:after="40" w:line="240" w:lineRule="auto"/>
+            </w:pPr>
+            <w:r>
+              <w:rPr>
+                <w:sz w:val="20"/>
+              </w:rPr>
+            </w:r>
+            <w:r>
+              <w:rPr>
+                <w:sz w:val="20"/>
+              </w:rPr>
+              <w:t>—</w:t>
+            </w:r>
+          </w:p>
+        </w:tc>
+        <w:tc>
+          <w:tcPr>
+            <w:tcW w:type="dxa" w:w="2160"/>
+          </w:tcPr>
+          <w:p>
+            <w:pPr>
+              <w:spacing w:after="40" w:line="240" w:lineRule="auto"/>
+            </w:pPr>
+            <w:r>
+              <w:rPr>
+                <w:sz w:val="20"/>
+              </w:rPr>
+            </w:r>
+            <w:r>
+              <w:rPr>
+                <w:sz w:val="20"/>
+              </w:rPr>
+              <w:t>Not represented</w:t>
+            </w:r>
+          </w:p>
+        </w:tc>
+      </w:tr>
+      <w:tr>
+        <w:tc>
+          <w:tcPr>
+            <w:tcW w:type="dxa" w:w="2160"/>
+          </w:tcPr>
+          <w:p>
+            <w:pPr>
+              <w:spacing w:after="40" w:line="240" w:lineRule="auto"/>
+            </w:pPr>
+            <w:r>
+              <w:rPr>
+                <w:sz w:val="20"/>
+              </w:rPr>
+            </w:r>
+            <w:r>
+              <w:rPr>
+                <w:sz w:val="20"/>
+              </w:rPr>
+              <w:t>Copper</w:t>
+            </w:r>
+          </w:p>
+        </w:tc>
+        <w:tc>
+          <w:tcPr>
+            <w:tcW w:type="dxa" w:w="2160"/>
+          </w:tcPr>
+          <w:p>
+            <w:pPr>
+              <w:spacing w:after="40" w:line="240" w:lineRule="auto"/>
+            </w:pPr>
+            <w:r>
+              <w:rPr>
+                <w:sz w:val="20"/>
+              </w:rPr>
+            </w:r>
+            <w:r>
+              <w:rPr>
+                <w:sz w:val="20"/>
+              </w:rPr>
+              <w:t>— (&lt;10⁻³)</w:t>
+            </w:r>
+          </w:p>
+        </w:tc>
+        <w:tc>
+          <w:tcPr>
+            <w:tcW w:type="dxa" w:w="2160"/>
+          </w:tcPr>
+          <w:p>
+            <w:pPr>
+              <w:spacing w:after="40" w:line="240" w:lineRule="auto"/>
+            </w:pPr>
+            <w:r>
+              <w:rPr>
+                <w:sz w:val="20"/>
+              </w:rPr>
+            </w:r>
+            <w:r>
+              <w:rPr>
+                <w:sz w:val="20"/>
+              </w:rPr>
+              <w:t>—</w:t>
+            </w:r>
+          </w:p>
+        </w:tc>
+        <w:tc>
+          <w:tcPr>
+            <w:tcW w:type="dxa" w:w="2160"/>
+          </w:tcPr>
+          <w:p>
+            <w:pPr>
+              <w:spacing w:after="40" w:line="240" w:lineRule="auto"/>
+            </w:pPr>
+            <w:r>
+              <w:rPr>
+                <w:sz w:val="20"/>
+              </w:rPr>
+            </w:r>
+            <w:r>
+              <w:rPr>
+                <w:sz w:val="20"/>
+              </w:rPr>
+              <w:t>Not represented</w:t>
+            </w:r>
+          </w:p>
+        </w:tc>
+      </w:tr>
+      <w:tr>
+        <w:tc>
+          <w:tcPr>
+            <w:tcW w:type="dxa" w:w="2160"/>
+          </w:tcPr>
+          <w:p>
+            <w:pPr>
+              <w:spacing w:after="40" w:line="240" w:lineRule="auto"/>
+            </w:pPr>
+            <w:r>
+              <w:rPr>
+                <w:sz w:val="20"/>
+              </w:rPr>
+            </w:r>
+            <w:r>
+              <w:rPr>
+                <w:sz w:val="20"/>
+              </w:rPr>
+              <w:t>Gold</w:t>
+            </w:r>
+          </w:p>
+        </w:tc>
+        <w:tc>
+          <w:tcPr>
+            <w:tcW w:type="dxa" w:w="2160"/>
+          </w:tcPr>
+          <w:p>
+            <w:pPr>
+              <w:spacing w:after="40" w:line="240" w:lineRule="auto"/>
+            </w:pPr>
+            <w:r>
+              <w:rPr>
+                <w:sz w:val="20"/>
+              </w:rPr>
+            </w:r>
+            <w:r>
+              <w:rPr>
+                <w:sz w:val="20"/>
+              </w:rPr>
+              <w:t>— (&lt;10⁻³)</w:t>
+            </w:r>
+          </w:p>
+        </w:tc>
+        <w:tc>
+          <w:tcPr>
+            <w:tcW w:type="dxa" w:w="2160"/>
+          </w:tcPr>
+          <w:p>
+            <w:pPr>
+              <w:spacing w:after="40" w:line="240" w:lineRule="auto"/>
+            </w:pPr>
+            <w:r>
+              <w:rPr>
+                <w:sz w:val="20"/>
+              </w:rPr>
+            </w:r>
+            <w:r>
+              <w:rPr>
+                <w:sz w:val="20"/>
+              </w:rPr>
+              <w:t>—</w:t>
+            </w:r>
+          </w:p>
+        </w:tc>
+        <w:tc>
+          <w:tcPr>
+            <w:tcW w:type="dxa" w:w="2160"/>
+          </w:tcPr>
+          <w:p>
+            <w:pPr>
+              <w:spacing w:after="40" w:line="240" w:lineRule="auto"/>
+            </w:pPr>
+            <w:r>
+              <w:rPr>
+                <w:sz w:val="20"/>
+              </w:rPr>
+            </w:r>
+            <w:r>
+              <w:rPr>
+                <w:sz w:val="20"/>
+              </w:rPr>
+              <w:t>Not represented</w:t>
+            </w:r>
+          </w:p>
+        </w:tc>
+      </w:tr>
+      <w:tr>
+        <w:tc>
+          <w:tcPr>
+            <w:tcW w:type="dxa" w:w="2160"/>
+          </w:tcPr>
+          <w:p>
+            <w:pPr>
+              <w:spacing w:after="40" w:line="240" w:lineRule="auto"/>
+            </w:pPr>
+            <w:r>
+              <w:rPr>
+                <w:sz w:val="20"/>
+              </w:rPr>
+            </w:r>
+            <w:r>
+              <w:rPr>
+                <w:sz w:val="20"/>
+              </w:rPr>
+              <w:t>Coal</w:t>
+            </w:r>
+          </w:p>
+        </w:tc>
+        <w:tc>
+          <w:tcPr>
+            <w:tcW w:type="dxa" w:w="2160"/>
+          </w:tcPr>
+          <w:p>
+            <w:pPr>
+              <w:spacing w:after="40" w:line="240" w:lineRule="auto"/>
+            </w:pPr>
+            <w:r>
+              <w:rPr>
+                <w:sz w:val="20"/>
+              </w:rPr>
+            </w:r>
+            <w:r>
+              <w:rPr>
+                <w:sz w:val="20"/>
+              </w:rPr>
+              <w:t>— (&lt;10⁻³)</w:t>
+            </w:r>
+          </w:p>
+        </w:tc>
+        <w:tc>
+          <w:tcPr>
+            <w:tcW w:type="dxa" w:w="2160"/>
+          </w:tcPr>
+          <w:p>
+            <w:pPr>
+              <w:spacing w:after="40" w:line="240" w:lineRule="auto"/>
+            </w:pPr>
+            <w:r>
+              <w:rPr>
+                <w:sz w:val="20"/>
+              </w:rPr>
+            </w:r>
+            <w:r>
+              <w:rPr>
+                <w:sz w:val="20"/>
+              </w:rPr>
+              <w:t>—</w:t>
+            </w:r>
+          </w:p>
+        </w:tc>
+        <w:tc>
+          <w:tcPr>
+            <w:tcW w:type="dxa" w:w="2160"/>
+          </w:tcPr>
+          <w:p>
+            <w:pPr>
+              <w:spacing w:after="40" w:line="240" w:lineRule="auto"/>
+            </w:pPr>
+            <w:r>
+              <w:rPr>
+                <w:sz w:val="20"/>
+              </w:rPr>
+            </w:r>
+            <w:r>
+              <w:rPr>
+                <w:sz w:val="20"/>
+              </w:rPr>
+              <w:t>Not represented</w:t>
+            </w:r>
+          </w:p>
+        </w:tc>
+      </w:tr>
+      <w:tr>
+        <w:tc>
+          <w:tcPr>
+            <w:tcW w:type="dxa" w:w="2160"/>
+          </w:tcPr>
+          <w:p>
+            <w:pPr>
+              <w:spacing w:after="40" w:line="240" w:lineRule="auto"/>
+            </w:pPr>
+            <w:r>
+              <w:rPr>
+                <w:sz w:val="20"/>
+              </w:rPr>
+            </w:r>
+            <w:r>
+              <w:rPr>
+                <w:sz w:val="20"/>
+              </w:rPr>
+              <w:t>Gas and peat</w:t>
+            </w:r>
+          </w:p>
+        </w:tc>
+        <w:tc>
+          <w:tcPr>
+            <w:tcW w:type="dxa" w:w="2160"/>
+          </w:tcPr>
+          <w:p>
+            <w:pPr>
+              <w:spacing w:after="40" w:line="240" w:lineRule="auto"/>
+            </w:pPr>
+            <w:r>
+              <w:rPr>
+                <w:sz w:val="20"/>
+              </w:rPr>
+            </w:r>
+            <w:r>
+              <w:rPr>
+                <w:sz w:val="20"/>
+              </w:rPr>
+              <w:t>— (&lt;10⁻³)</w:t>
+            </w:r>
+          </w:p>
+        </w:tc>
+        <w:tc>
+          <w:tcPr>
+            <w:tcW w:type="dxa" w:w="2160"/>
+          </w:tcPr>
+          <w:p>
+            <w:pPr>
+              <w:spacing w:after="40" w:line="240" w:lineRule="auto"/>
+            </w:pPr>
+            <w:r>
+              <w:rPr>
+                <w:sz w:val="20"/>
+              </w:rPr>
+            </w:r>
+            <w:r>
+              <w:rPr>
+                <w:sz w:val="20"/>
+              </w:rPr>
+              <w:t>—</w:t>
+            </w:r>
+          </w:p>
+        </w:tc>
+        <w:tc>
+          <w:tcPr>
+            <w:tcW w:type="dxa" w:w="2160"/>
+          </w:tcPr>
+          <w:p>
+            <w:pPr>
+              <w:spacing w:after="40" w:line="240" w:lineRule="auto"/>
+            </w:pPr>
+            <w:r>
+              <w:rPr>
+                <w:sz w:val="20"/>
+              </w:rPr>
+            </w:r>
+            <w:r>
+              <w:rPr>
+                <w:sz w:val="20"/>
+              </w:rPr>
+              <w:t>Not represented</w:t>
+            </w:r>
+          </w:p>
+        </w:tc>
+      </w:tr>
+      <w:tr>
+        <w:tc>
+          <w:tcPr>
+            <w:tcW w:type="dxa" w:w="2160"/>
+          </w:tcPr>
+          <w:p>
+            <w:pPr>
+              <w:spacing w:after="40" w:line="240" w:lineRule="auto"/>
+            </w:pPr>
+            <w:r>
+              <w:rPr>
+                <w:sz w:val="20"/>
+              </w:rPr>
+            </w:r>
+            <w:r>
+              <w:rPr>
+                <w:sz w:val="20"/>
+              </w:rPr>
+              <w:t>Oil</w:t>
+            </w:r>
+          </w:p>
+        </w:tc>
+        <w:tc>
+          <w:tcPr>
+            <w:tcW w:type="dxa" w:w="2160"/>
+          </w:tcPr>
+          <w:p>
+            <w:pPr>
+              <w:spacing w:after="40" w:line="240" w:lineRule="auto"/>
+            </w:pPr>
+            <w:r>
+              <w:rPr>
+                <w:sz w:val="20"/>
+              </w:rPr>
+            </w:r>
+            <w:r>
+              <w:rPr>
+                <w:sz w:val="20"/>
+              </w:rPr>
+              <w:t>— (&lt;10⁻³)</w:t>
+            </w:r>
+          </w:p>
+        </w:tc>
+        <w:tc>
+          <w:tcPr>
+            <w:tcW w:type="dxa" w:w="2160"/>
+          </w:tcPr>
+          <w:p>
+            <w:pPr>
+              <w:spacing w:after="40" w:line="240" w:lineRule="auto"/>
+            </w:pPr>
+            <w:r>
+              <w:rPr>
+                <w:sz w:val="20"/>
+              </w:rPr>
+            </w:r>
+            <w:r>
+              <w:rPr>
+                <w:sz w:val="20"/>
+              </w:rPr>
+              <w:t>—</w:t>
+            </w:r>
+          </w:p>
+        </w:tc>
+        <w:tc>
+          <w:tcPr>
+            <w:tcW w:type="dxa" w:w="2160"/>
+          </w:tcPr>
+          <w:p>
+            <w:pPr>
+              <w:spacing w:after="40" w:line="240" w:lineRule="auto"/>
+            </w:pPr>
+            <w:r>
+              <w:rPr>
+                <w:sz w:val="20"/>
+              </w:rPr>
+            </w:r>
+            <w:r>
+              <w:rPr>
+                <w:sz w:val="20"/>
+              </w:rPr>
+              <w:t>Not represented</w:t>
+            </w:r>
+          </w:p>
+        </w:tc>
+      </w:tr>
+    </w:tbl>
+    <w:p>
+      <w:pPr>
+        <w:spacing w:before="120" w:after="240"/>
+        <w:jc w:val="both"/>
+      </w:pPr>
+      <w:r>
+        <w:rPr>
+          <w:i/>
+          <w:sz w:val="20"/>
+        </w:rPr>
+        <w:t>Note: Three features distinguish the decomposition from a subcategory total. (i) It does not span the classification: six of fifteen subcategories receive near-zero loadings, so the NTF isolates the high-variance systems rather than reproducing the full taxonomy. (ii) It attaches country and temporal structure to each system (e.g., Brazil's dominance of metal ores; the divergent trends in Table 2). (iii) Most diagnostically, C5 couples two materials (crop residues, grazed biomass) with specific livestock sectors (cattle, sheep and goats) into a single feed–livestock system — a cross-dimensional linkage that no static subcategory total can express.</w:t>
       </w:r>
     </w:p>
     <w:p>
@@ -8110,7 +10649,7 @@
           <w:i/>
           <w:sz w:val="20"/>
         </w:rPr>
-        <w:t>Fig. S1.</w:t>
+        <w:t>Fig. S1</w:t>
       </w:r>
       <w:r>
         <w:rPr>
@@ -8147,7 +10686,7 @@
           <w:i/>
           <w:sz w:val="20"/>
         </w:rPr>
-        <w:t>² = 0.75). Each row represents one component; columns display the country, sector, material subcategory, and temporal loadings, respectively. Loadings are unit-normalised.</w:t>
+        <w:t>² = 0.75). Each row represents one component; columns display the country, sector, material subcategory, and temporal loadings, respectively. Loadings are unit-normalised</w:t>
       </w:r>
     </w:p>
     <w:p>
@@ -8208,14 +10747,14 @@
           <w:i/>
           <w:sz w:val="20"/>
         </w:rPr>
-        <w:t>Fig. S2.</w:t>
+        <w:t>Fig. S2</w:t>
       </w:r>
       <w:r>
         <w:rPr>
           <w:i/>
           <w:sz w:val="20"/>
         </w:rPr>
-        <w:t xml:space="preserve"> Comparison of sector loadings between MERCOSUR-4 and EU-27 countries for each of the six NTF components. Top 10 sectors per component, weighted by bloc, showing bilateral sector loading profiles.</w:t>
+        <w:t xml:space="preserve"> Comparison of sector loadings between MERCOSUR-4 and EU-27 countries for each of the six NTF components. Top 10 sectors per component, weighted by bloc, showing bilateral sector loading profiles</w:t>
       </w:r>
     </w:p>
     <w:p>
@@ -8276,7 +10815,7 @@
           <w:i/>
           <w:sz w:val="20"/>
         </w:rPr>
-        <w:t>Fig. S3.</w:t>
+        <w:t>Fig. S3</w:t>
       </w:r>
       <w:r>
         <w:rPr>
@@ -8328,7 +10867,22 @@
           <w:i/>
           <w:sz w:val="20"/>
         </w:rPr>
-        <w:t xml:space="preserve">² gain per additional component. The elbow at </w:t>
+        <w:t xml:space="preserve">² gain per additional component. Variance explained rises smoothly with </w:t>
+      </w:r>
+      <w:r>
+        <w:rPr>
+          <w:b w:val="0"/>
+          <w:i/>
+          <w:sz w:val="20"/>
+        </w:rPr>
+        <w:t>K</w:t>
+      </w:r>
+      <w:r>
+        <w:rPr>
+          <w:i/>
+          <w:sz w:val="20"/>
+        </w:rPr>
+        <w:t xml:space="preserve"> and the marginal gain shows no sharp elbow; </w:t>
       </w:r>
       <w:r>
         <w:rPr>
@@ -8358,22 +10912,7 @@
           <w:i/>
           <w:sz w:val="20"/>
         </w:rPr>
-        <w:t xml:space="preserve">² = 0.75) indicates the selected rank; marginal gains fall below 0.02 for all </w:t>
-      </w:r>
-      <w:r>
-        <w:rPr>
-          <w:b w:val="0"/>
-          <w:i/>
-          <w:sz w:val="20"/>
-        </w:rPr>
-        <w:t>K</w:t>
-      </w:r>
-      <w:r>
-        <w:rPr>
-          <w:i/>
-          <w:sz w:val="20"/>
-        </w:rPr>
-        <w:t xml:space="preserve"> &gt; 7.</w:t>
+        <w:t>² = 0.75) is adopted as a parsimonious, interpretable rank rather than a statistically unique optimum (Section 3.4.2)</w:t>
       </w:r>
     </w:p>
     <w:p>
@@ -8434,14 +10973,14 @@
           <w:i/>
           <w:sz w:val="20"/>
         </w:rPr>
-        <w:t>Fig. S4.</w:t>
+        <w:t>Fig. S4</w:t>
       </w:r>
       <w:r>
         <w:rPr>
           <w:i/>
           <w:sz w:val="20"/>
         </w:rPr>
-        <w:t xml:space="preserve"> Temporal evolution of NTF components by bloc, 1990–2022. Each panel shows the year loading weighted by the mean country loading for MERCOSUR (red) and EU-27 (blue). C5 (livestock and grazing) displays the widest and most rapidly expanding inter-bloc divergence, whilst C3 (fishery and aquatic) remains essentially stable for both blocs.</w:t>
+        <w:t xml:space="preserve"> Temporal evolution of NTF components by bloc, 1990–2022. Each panel shows the year loading weighted by the mean country loading for MERCOSUR (red) and EU-27 (blue). C5 (livestock and grazing) displays the widest and most rapidly expanding inter-bloc divergence, whilst C3 (fishery and aquatic) remains essentially stable for both blocs</w:t>
       </w:r>
     </w:p>
     <w:sectPr>

</xml_diff>